<commit_message>
docs: se actualizo el documento word
</commit_message>
<xml_diff>
--- a/Prompts_dashboard_ChatGPT.docx
+++ b/Prompts_dashboard_ChatGPT.docx
@@ -1,15 +1,19 @@
 
 <file path=word/document.xml><?xml version="1.0" encoding="utf-8"?>
-<w:document xmlns:wpc="http://schemas.microsoft.com/office/word/2010/wordprocessingCanvas" xmlns:mc="http://schemas.openxmlformats.org/markup-compatibility/2006" xmlns:o="urn:schemas-microsoft-com:office:office" xmlns:r="http://schemas.openxmlformats.org/officeDocument/2006/relationships" xmlns:m="http://schemas.openxmlformats.org/officeDocument/2006/math" xmlns:v="urn:schemas-microsoft-com:vml" xmlns:wp14="http://schemas.microsoft.com/office/word/2010/wordprocessingDrawing" xmlns:wp="http://schemas.openxmlformats.org/drawingml/2006/wordprocessingDrawing" xmlns:w10="urn:schemas-microsoft-com:office:word" xmlns:w="http://schemas.openxmlformats.org/wordprocessingml/2006/main" xmlns:w14="http://schemas.microsoft.com/office/word/2010/wordml" xmlns:w15="http://schemas.microsoft.com/office/word/2012/wordml" xmlns:wpg="http://schemas.microsoft.com/office/word/2010/wordprocessingGroup" xmlns:wpi="http://schemas.microsoft.com/office/word/2010/wordprocessingInk" xmlns:wne="http://schemas.microsoft.com/office/word/2006/wordml" xmlns:wps="http://schemas.microsoft.com/office/word/2010/wordprocessingShape" mc:Ignorable="w14 w15 wp14">
+<w:document xmlns:wpc="http://schemas.microsoft.com/office/word/2010/wordprocessingCanvas" xmlns:cx="http://schemas.microsoft.com/office/drawing/2014/chartex" xmlns:cx1="http://schemas.microsoft.com/office/drawing/2015/9/8/chartex" xmlns:cx2="http://schemas.microsoft.com/office/drawing/2015/10/21/chartex" xmlns:cx3="http://schemas.microsoft.com/office/drawing/2016/5/9/chartex" xmlns:cx4="http://schemas.microsoft.com/office/drawing/2016/5/10/chartex" xmlns:cx5="http://schemas.microsoft.com/office/drawing/2016/5/11/chartex" xmlns:cx6="http://schemas.microsoft.com/office/drawing/2016/5/12/chartex" xmlns:cx7="http://schemas.microsoft.com/office/drawing/2016/5/13/chartex" xmlns:cx8="http://schemas.microsoft.com/office/drawing/2016/5/14/chartex" xmlns:mc="http://schemas.openxmlformats.org/markup-compatibility/2006" xmlns:m="http://schemas.openxmlformats.org/officeDocument/2006/math" xmlns:aink="http://schemas.microsoft.com/office/drawing/2016/ink" xmlns:am3d="http://schemas.microsoft.com/office/drawing/2017/model3d" xmlns:oel="http://schemas.microsoft.com/office/2019/extlst" xmlns:r="http://schemas.openxmlformats.org/officeDocument/2006/relationships" xmlns:wp14="http://schemas.microsoft.com/office/word/2010/wordprocessingDrawing" xmlns:wp="http://schemas.openxmlformats.org/drawingml/2006/wordprocessingDrawing" xmlns:wpg="http://schemas.microsoft.com/office/word/2010/wordprocessingGroup" xmlns:wpi="http://schemas.microsoft.com/office/word/2010/wordprocessingInk" xmlns:wps="http://schemas.microsoft.com/office/word/2010/wordprocessingShape" xmlns:o="urn:schemas-microsoft-com:office:office" xmlns:v="urn:schemas-microsoft-com:vml" xmlns:w10="urn:schemas-microsoft-com:office:word" xmlns:w="http://schemas.openxmlformats.org/wordprocessingml/2006/main" xmlns:w14="http://schemas.microsoft.com/office/word/2010/wordml" xmlns:w15="http://schemas.microsoft.com/office/word/2012/wordml" xmlns:w16cex="http://schemas.microsoft.com/office/word/2018/wordml/cex" xmlns:w16cid="http://schemas.microsoft.com/office/word/2016/wordml/cid" xmlns:w16="http://schemas.microsoft.com/office/word/2018/wordml" xmlns:w16sdtdh="http://schemas.microsoft.com/office/word/2020/wordml/sdtdatahash" xmlns:w16sdtfl="http://schemas.microsoft.com/office/word/2024/wordml/sdtformatlock" xmlns:w16se="http://schemas.microsoft.com/office/word/2015/wordml/symex" xmlns:w16du="http://schemas.microsoft.com/office/word/2023/wordml/word16du" xmlns:wne="http://schemas.microsoft.com/office/word/2006/wordml" mc:Ignorable="w14 w15 w16se w16cid w16 w16cex w16sdtdh w16sdtfl w16du wp14">
   <w:body>
     <w:p>
       <w:pPr>
         <w:jc w:val="center"/>
+        <w:rPr>
+          <w:lang w:val="es-AR"/>
+        </w:rPr>
       </w:pPr>
       <w:r>
         <w:rPr>
           <w:b/>
           <w:sz w:val="36"/>
+          <w:lang w:val="es-AR"/>
         </w:rPr>
         <w:t>CONVERSACIÓN CON CHATGPT</w:t>
       </w:r>
@@ -17,249 +21,337 @@
         <w:rPr>
           <w:b/>
           <w:sz w:val="36"/>
+          <w:lang w:val="es-AR"/>
         </w:rPr>
         <w:br/>
       </w:r>
+      <w:proofErr w:type="spellStart"/>
       <w:r>
         <w:rPr>
           <w:b/>
           <w:sz w:val="28"/>
+          <w:lang w:val="es-AR"/>
         </w:rPr>
         <w:t>Construction</w:t>
       </w:r>
+      <w:proofErr w:type="spellEnd"/>
       <w:r>
         <w:rPr>
           <w:b/>
           <w:sz w:val="28"/>
-        </w:rPr>
-        <w:t xml:space="preserve"> y refinamiento </w:t>
-      </w:r>
-      <w:proofErr w:type="gramStart"/>
+          <w:lang w:val="es-AR"/>
+        </w:rPr>
+        <w:t xml:space="preserve"> y refinamiento del </w:t>
+      </w:r>
+      <w:proofErr w:type="spellStart"/>
       <w:r>
         <w:rPr>
           <w:b/>
           <w:sz w:val="28"/>
-        </w:rPr>
-        <w:t>del</w:t>
-      </w:r>
-      <w:proofErr w:type="gramEnd"/>
+          <w:lang w:val="es-AR"/>
+        </w:rPr>
+        <w:t>Dashboard</w:t>
+      </w:r>
+      <w:proofErr w:type="spellEnd"/>
       <w:r>
         <w:rPr>
           <w:b/>
           <w:sz w:val="28"/>
-        </w:rPr>
-        <w:t xml:space="preserve"> Dashboard de Ventas</w:t>
+          <w:lang w:val="es-AR"/>
+        </w:rPr>
+        <w:t xml:space="preserve"> de Ventas</w:t>
       </w:r>
     </w:p>
     <w:p>
+      <w:pPr>
+        <w:rPr>
+          <w:lang w:val="es-AR"/>
+        </w:rPr>
+      </w:pPr>
+      <w:r>
+        <w:rPr>
+          <w:lang w:val="es-AR"/>
+        </w:rPr>
+        <w:t xml:space="preserve">Ya que no </w:t>
+      </w:r>
       <w:proofErr w:type="spellStart"/>
       <w:r>
-        <w:t>Ya</w:t>
+        <w:rPr>
+          <w:lang w:val="es-AR"/>
+        </w:rPr>
+        <w:t>sabia</w:t>
       </w:r>
       <w:proofErr w:type="spellEnd"/>
       <w:r>
-        <w:t xml:space="preserve"> que no </w:t>
+        <w:rPr>
+          <w:lang w:val="es-AR"/>
+        </w:rPr>
+        <w:t xml:space="preserve"> </w:t>
       </w:r>
       <w:proofErr w:type="spellStart"/>
       <w:r>
-        <w:t>sabia</w:t>
+        <w:rPr>
+          <w:lang w:val="es-AR"/>
+        </w:rPr>
+        <w:t>como</w:t>
       </w:r>
       <w:proofErr w:type="spellEnd"/>
       <w:r>
+        <w:rPr>
+          <w:lang w:val="es-AR"/>
+        </w:rPr>
+        <w:t xml:space="preserve"> hacer para sacar un registro de </w:t>
+      </w:r>
+      <w:proofErr w:type="spellStart"/>
+      <w:r>
+        <w:rPr>
+          <w:lang w:val="es-AR"/>
+        </w:rPr>
+        <w:t>prompts</w:t>
+      </w:r>
+      <w:proofErr w:type="spellEnd"/>
+      <w:r>
+        <w:rPr>
+          <w:lang w:val="es-AR"/>
+        </w:rPr>
+        <w:t xml:space="preserve">, le </w:t>
+      </w:r>
+      <w:proofErr w:type="spellStart"/>
+      <w:r>
+        <w:rPr>
+          <w:lang w:val="es-AR"/>
+        </w:rPr>
+        <w:t>pedi</w:t>
+      </w:r>
+      <w:proofErr w:type="spellEnd"/>
+      <w:r>
+        <w:rPr>
+          <w:lang w:val="es-AR"/>
+        </w:rPr>
+        <w:t xml:space="preserve"> a </w:t>
+      </w:r>
+      <w:proofErr w:type="spellStart"/>
+      <w:r>
+        <w:rPr>
+          <w:lang w:val="es-AR"/>
+        </w:rPr>
+        <w:t>ChatGPT</w:t>
+      </w:r>
+      <w:proofErr w:type="spellEnd"/>
+      <w:r>
+        <w:rPr>
+          <w:lang w:val="es-AR"/>
+        </w:rPr>
+        <w:t xml:space="preserve"> que me arme un archive el cual contenga toda nuestra </w:t>
+      </w:r>
+      <w:proofErr w:type="spellStart"/>
+      <w:r>
+        <w:rPr>
+          <w:lang w:val="es-AR"/>
+        </w:rPr>
+        <w:t>conversacion</w:t>
+      </w:r>
+      <w:proofErr w:type="spellEnd"/>
+      <w:r>
+        <w:rPr>
+          <w:lang w:val="es-AR"/>
+        </w:rPr>
+        <w:t xml:space="preserve"> para el Proyecto, y me armo el siguiente </w:t>
+      </w:r>
+      <w:proofErr w:type="spellStart"/>
+      <w:r>
+        <w:rPr>
+          <w:lang w:val="es-AR"/>
+        </w:rPr>
+        <w:t>document</w:t>
+      </w:r>
+      <w:proofErr w:type="spellEnd"/>
+      <w:r>
+        <w:rPr>
+          <w:lang w:val="es-AR"/>
+        </w:rPr>
         <w:t xml:space="preserve"> </w:t>
       </w:r>
       <w:proofErr w:type="spellStart"/>
-      <w:proofErr w:type="gramStart"/>
-      <w:r>
-        <w:t>como</w:t>
+      <w:r>
+        <w:rPr>
+          <w:lang w:val="es-AR"/>
+        </w:rPr>
+        <w:t>docs</w:t>
       </w:r>
       <w:proofErr w:type="spellEnd"/>
-      <w:proofErr w:type="gramEnd"/>
-      <w:r>
+      <w:r>
+        <w:rPr>
+          <w:lang w:val="es-AR"/>
+        </w:rPr>
+        <w:t>, espero que sirva para lo pedido</w:t>
+      </w:r>
+      <w:r>
+        <w:rPr>
+          <w:lang w:val="es-AR"/>
+        </w:rPr>
+        <w:t xml:space="preserve">, también para dejar en claro para este </w:t>
+      </w:r>
+      <w:proofErr w:type="spellStart"/>
+      <w:r>
+        <w:rPr>
+          <w:lang w:val="es-AR"/>
+        </w:rPr>
+        <w:t>Dashboard</w:t>
+      </w:r>
+      <w:proofErr w:type="spellEnd"/>
+      <w:r>
+        <w:rPr>
+          <w:lang w:val="es-AR"/>
+        </w:rPr>
         <w:t xml:space="preserve"> </w:t>
       </w:r>
       <w:proofErr w:type="spellStart"/>
       <w:r>
-        <w:t>hacer</w:t>
+        <w:rPr>
+          <w:lang w:val="es-AR"/>
+        </w:rPr>
+        <w:t>volvi</w:t>
       </w:r>
       <w:proofErr w:type="spellEnd"/>
       <w:r>
-        <w:t xml:space="preserve"> para </w:t>
+        <w:rPr>
+          <w:lang w:val="es-AR"/>
+        </w:rPr>
+        <w:t xml:space="preserve"> a la base que había quedado luego de la entrega del </w:t>
       </w:r>
       <w:proofErr w:type="spellStart"/>
       <w:r>
-        <w:t>sacar</w:t>
+        <w:rPr>
+          <w:lang w:val="es-AR"/>
+        </w:rPr>
+        <w:t>Checkpoint</w:t>
       </w:r>
       <w:proofErr w:type="spellEnd"/>
       <w:r>
-        <w:t xml:space="preserve"> un </w:t>
-      </w:r>
-      <w:proofErr w:type="spellStart"/>
-      <w:r>
-        <w:t>registro</w:t>
-      </w:r>
-      <w:proofErr w:type="spellEnd"/>
-      <w:r>
-        <w:t xml:space="preserve"> de prompts, le </w:t>
-      </w:r>
-      <w:proofErr w:type="spellStart"/>
-      <w:r>
-        <w:t>pedi</w:t>
-      </w:r>
-      <w:proofErr w:type="spellEnd"/>
-      <w:r>
-        <w:t xml:space="preserve"> a </w:t>
-      </w:r>
-      <w:proofErr w:type="spellStart"/>
-      <w:r>
-        <w:t>ChatGPT</w:t>
-      </w:r>
-      <w:proofErr w:type="spellEnd"/>
-      <w:r>
-        <w:t xml:space="preserve"> que me </w:t>
-      </w:r>
-      <w:proofErr w:type="spellStart"/>
-      <w:r>
-        <w:t>arme</w:t>
-      </w:r>
-      <w:proofErr w:type="spellEnd"/>
-      <w:r>
-        <w:t xml:space="preserve"> un archive el </w:t>
-      </w:r>
-      <w:proofErr w:type="spellStart"/>
-      <w:r>
-        <w:t>cual</w:t>
-      </w:r>
-      <w:proofErr w:type="spellEnd"/>
-      <w:r>
-        <w:t xml:space="preserve"> </w:t>
-      </w:r>
-      <w:proofErr w:type="spellStart"/>
-      <w:r>
-        <w:t>contenga</w:t>
-      </w:r>
-      <w:proofErr w:type="spellEnd"/>
-      <w:r>
-        <w:t xml:space="preserve"> </w:t>
-      </w:r>
-      <w:proofErr w:type="spellStart"/>
-      <w:r>
-        <w:t>toda</w:t>
-      </w:r>
-      <w:proofErr w:type="spellEnd"/>
-      <w:r>
-        <w:t xml:space="preserve"> </w:t>
-      </w:r>
-      <w:proofErr w:type="spellStart"/>
-      <w:r>
-        <w:t>nuestra</w:t>
-      </w:r>
-      <w:proofErr w:type="spellEnd"/>
-      <w:r>
-        <w:t xml:space="preserve"> </w:t>
-      </w:r>
-      <w:proofErr w:type="spellStart"/>
-      <w:r>
-        <w:t>conversacion</w:t>
-      </w:r>
-      <w:proofErr w:type="spellEnd"/>
-      <w:r>
-        <w:t xml:space="preserve"> para el Proyecto, y me </w:t>
-      </w:r>
-      <w:proofErr w:type="spellStart"/>
-      <w:r>
-        <w:t>armo</w:t>
-      </w:r>
-      <w:proofErr w:type="spellEnd"/>
-      <w:r>
-        <w:t xml:space="preserve"> el </w:t>
-      </w:r>
-      <w:proofErr w:type="spellStart"/>
-      <w:r>
-        <w:t>siguiente</w:t>
-      </w:r>
-      <w:proofErr w:type="spellEnd"/>
-      <w:r>
-        <w:t xml:space="preserve"> document docs, </w:t>
-      </w:r>
-      <w:proofErr w:type="spellStart"/>
-      <w:r>
-        <w:t>espero</w:t>
-      </w:r>
-      <w:proofErr w:type="spellEnd"/>
-      <w:r>
-        <w:t xml:space="preserve"> que </w:t>
-      </w:r>
-      <w:proofErr w:type="spellStart"/>
-      <w:r>
-        <w:t>sirva</w:t>
-      </w:r>
-      <w:proofErr w:type="spellEnd"/>
-      <w:r>
-        <w:t xml:space="preserve"> para lo </w:t>
-      </w:r>
-      <w:proofErr w:type="spellStart"/>
-      <w:r>
-        <w:t>pedi</w:t>
-      </w:r>
-      <w:bookmarkStart w:id="0" w:name="_GoBack"/>
-      <w:bookmarkEnd w:id="0"/>
-      <w:r>
-        <w:t>do</w:t>
-      </w:r>
-      <w:proofErr w:type="spellEnd"/>
-      <w:r>
-        <w:t>.</w:t>
+        <w:rPr>
+          <w:lang w:val="es-AR"/>
+        </w:rPr>
+        <w:t xml:space="preserve"> numero 5.</w:t>
       </w:r>
     </w:p>
     <w:p>
-      <w:proofErr w:type="spellStart"/>
+      <w:pPr>
+        <w:rPr>
+          <w:lang w:val="es-AR"/>
+        </w:rPr>
+      </w:pPr>
       <w:r>
         <w:rPr>
           <w:b/>
           <w:sz w:val="26"/>
-        </w:rPr>
-        <w:t>Construcción</w:t>
-      </w:r>
-      <w:proofErr w:type="spellEnd"/>
+          <w:lang w:val="es-AR"/>
+        </w:rPr>
+        <w:t xml:space="preserve">Construcción del </w:t>
+      </w:r>
+      <w:proofErr w:type="spellStart"/>
       <w:r>
         <w:rPr>
           <w:b/>
           <w:sz w:val="26"/>
-        </w:rPr>
-        <w:t xml:space="preserve"> del dashboard</w:t>
-      </w:r>
+          <w:lang w:val="es-AR"/>
+        </w:rPr>
+        <w:t>dashboard</w:t>
+      </w:r>
+      <w:proofErr w:type="spellEnd"/>
     </w:p>
     <w:p>
       <w:pPr>
         <w:spacing w:after="60"/>
+        <w:rPr>
+          <w:lang w:val="es-AR"/>
+        </w:rPr>
       </w:pPr>
+      <w:proofErr w:type="spellStart"/>
       <w:r>
         <w:rPr>
           <w:b/>
-        </w:rPr>
-        <w:t>Prompt 1 — Usuario</w:t>
+          <w:lang w:val="es-AR"/>
+        </w:rPr>
+        <w:t>Prompt</w:t>
+      </w:r>
+      <w:proofErr w:type="spellEnd"/>
+      <w:r>
+        <w:rPr>
+          <w:b/>
+          <w:lang w:val="es-AR"/>
+        </w:rPr>
+        <w:t xml:space="preserve"> 1 — Usuario</w:t>
       </w:r>
     </w:p>
     <w:p>
       <w:pPr>
         <w:spacing w:after="160"/>
         <w:ind w:left="360"/>
+        <w:rPr>
+          <w:lang w:val="es-AR"/>
+        </w:rPr>
       </w:pPr>
       <w:r>
-        <w:t>Te voy a proporcionar una base de datos de ventas de repuestos automotrices. Analizá la información e identificá las principales variables disponibles, como fecha, región, categoría, producto,</w:t>
-      </w:r>
-      <w:r>
-        <w:t xml:space="preserve"> cliente, unidades vendidas y venta neta. Quiero construir un dashboard ejecutivo en Excel/Power BI orientado a detectar tendencias de ventas.</w:t>
+        <w:rPr>
+          <w:lang w:val="es-AR"/>
+        </w:rPr>
+        <w:t xml:space="preserve">Te voy a proporcionar una base de datos de ventas de repuestos automotrices. </w:t>
+      </w:r>
+      <w:proofErr w:type="spellStart"/>
+      <w:r>
+        <w:rPr>
+          <w:lang w:val="es-AR"/>
+        </w:rPr>
+        <w:t>Analizá</w:t>
+      </w:r>
+      <w:proofErr w:type="spellEnd"/>
+      <w:r>
+        <w:rPr>
+          <w:lang w:val="es-AR"/>
+        </w:rPr>
+        <w:t xml:space="preserve"> la información e </w:t>
+      </w:r>
+      <w:proofErr w:type="spellStart"/>
+      <w:r>
+        <w:rPr>
+          <w:lang w:val="es-AR"/>
+        </w:rPr>
+        <w:t>identificá</w:t>
+      </w:r>
+      <w:proofErr w:type="spellEnd"/>
+      <w:r>
+        <w:rPr>
+          <w:lang w:val="es-AR"/>
+        </w:rPr>
+        <w:t xml:space="preserve"> las principales variables disponibles, como fecha, región, categoría, producto, cliente, unidades vendidas y venta neta. Quiero construir un </w:t>
+      </w:r>
+      <w:proofErr w:type="spellStart"/>
+      <w:r>
+        <w:rPr>
+          <w:lang w:val="es-AR"/>
+        </w:rPr>
+        <w:t>dashboard</w:t>
+      </w:r>
+      <w:proofErr w:type="spellEnd"/>
+      <w:r>
+        <w:rPr>
+          <w:lang w:val="es-AR"/>
+        </w:rPr>
+        <w:t xml:space="preserve"> ejecutivo en Excel/Power BI orientado a detectar tendencias de ventas.</w:t>
       </w:r>
     </w:p>
     <w:p>
       <w:pPr>
         <w:spacing w:after="80"/>
+        <w:rPr>
+          <w:lang w:val="es-AR"/>
+        </w:rPr>
       </w:pPr>
       <w:r>
         <w:rPr>
           <w:sz w:val="14"/>
+          <w:lang w:val="es-AR"/>
         </w:rPr>
         <w:t>──────────────────────────────────────────────────────────────────────────────────────────</w:t>
       </w:r>
@@ -267,713 +359,22 @@
     <w:p>
       <w:pPr>
         <w:spacing w:after="60"/>
+        <w:rPr>
+          <w:lang w:val="es-AR"/>
+        </w:rPr>
       </w:pPr>
       <w:r>
         <w:rPr>
           <w:b/>
-        </w:rPr>
-        <w:t>Respuesta — ChatGPT</w:t>
-      </w:r>
-    </w:p>
-    <w:p>
-      <w:pPr>
-        <w:spacing w:after="160"/>
-        <w:ind w:left="360"/>
-      </w:pPr>
-      <w:r>
-        <w:t xml:space="preserve">A </w:t>
-      </w:r>
-      <w:r>
-        <w:t>partir de la estructura de los datos, las variables pueden organizarse en cinco grupos:</w:t>
-      </w:r>
-      <w:r>
-        <w:br/>
-      </w:r>
-      <w:r>
-        <w:br/>
-        <w:t>• Variables temporales: mes/período y año.</w:t>
-      </w:r>
-      <w:r>
-        <w:br/>
-        <w:t>• Variables geográficas: región y, si existe, zona o sucursal.</w:t>
-      </w:r>
-      <w:r>
-        <w:br/>
-        <w:t>• Variables comerciales: venta neta, unidades vendidas, ticke</w:t>
-      </w:r>
-      <w:r>
-        <w:t>t promedio y meta de venta.</w:t>
-      </w:r>
-      <w:r>
-        <w:br/>
-        <w:t>• Variables de producto: categoría, producto/SKU y familia de producto.</w:t>
-      </w:r>
-      <w:r>
-        <w:br/>
-        <w:t>• Variables de cliente: cliente/comprador y unidades compradas.</w:t>
-      </w:r>
-      <w:r>
-        <w:br/>
-      </w:r>
-      <w:r>
-        <w:br/>
-        <w:t>Para el dashboard ejecutivo recomiendo enfocarse principalmente en:</w:t>
-      </w:r>
-      <w:r>
-        <w:br/>
-        <w:t xml:space="preserve">1. Venta neta: permite </w:t>
-      </w:r>
-      <w:r>
-        <w:t>conocer la facturación generada.</w:t>
-      </w:r>
-      <w:r>
-        <w:br/>
-        <w:t>2. Unidades vendidas: muestra el volumen comercial.</w:t>
-      </w:r>
-      <w:r>
-        <w:br/>
-        <w:t>3. Cumplimiento de meta: permite comparar la venta contra el objetivo.</w:t>
-      </w:r>
-      <w:r>
-        <w:br/>
-        <w:t>4. Ticket/precio promedio: ayuda a distinguir entre crecimiento por volumen y crecimiento por valor.</w:t>
-      </w:r>
-      <w:r>
-        <w:br/>
-      </w:r>
-      <w:r>
-        <w:br/>
-        <w:t>El dashboard debería permitir analizar estos indicadores por período, categoría y región.</w:t>
-      </w:r>
-    </w:p>
-    <w:p>
-      <w:pPr>
-        <w:spacing w:after="80"/>
-      </w:pPr>
-      <w:r>
-        <w:rPr>
-          <w:sz w:val="14"/>
-        </w:rPr>
-        <w:t>──────────────────────────────────────────────────────────────────────────────────────────</w:t>
-      </w:r>
-    </w:p>
-    <w:p>
-      <w:pPr>
-        <w:spacing w:after="60"/>
-      </w:pPr>
+          <w:lang w:val="es-AR"/>
+        </w:rPr>
+        <w:t xml:space="preserve">Respuesta — </w:t>
+      </w:r>
+      <w:proofErr w:type="spellStart"/>
       <w:r>
         <w:rPr>
           <w:b/>
-        </w:rPr>
-        <w:t>Prompt 2 — Usuario</w:t>
-      </w:r>
-    </w:p>
-    <w:p>
-      <w:pPr>
-        <w:spacing w:after="160"/>
-        <w:ind w:left="360"/>
-      </w:pPr>
-      <w:r>
-        <w:t>A partir de esta base de ventas, proponeme los KPI más</w:t>
-      </w:r>
-      <w:r>
-        <w:t xml:space="preserve"> importantes para un dashboard comercial. Quiero que sean fáciles de interpretar y que permitan analizar facturación, cumplimiento de objetivos, volumen vendido y comportamiento de los clientes. Priorizá 4 KPI principales para colocar en la parte superior </w:t>
-      </w:r>
-      <w:r>
-        <w:t>del dashboard.</w:t>
-      </w:r>
-    </w:p>
-    <w:p>
-      <w:pPr>
-        <w:spacing w:after="80"/>
-      </w:pPr>
-      <w:r>
-        <w:rPr>
-          <w:sz w:val="14"/>
-        </w:rPr>
-        <w:t>──────────────────────────────────────────────────────────────────────────────────────────</w:t>
-      </w:r>
-    </w:p>
-    <w:p>
-      <w:pPr>
-        <w:spacing w:after="60"/>
-      </w:pPr>
-      <w:r>
-        <w:rPr>
-          <w:b/>
-        </w:rPr>
-        <w:t>Respuesta — ChatGPT</w:t>
-      </w:r>
-    </w:p>
-    <w:p>
-      <w:pPr>
-        <w:spacing w:after="160"/>
-        <w:ind w:left="360"/>
-      </w:pPr>
-      <w:r>
-        <w:t>Para la parte superior del dashboard utilizaría cuatro KPI:</w:t>
-      </w:r>
-      <w:r>
-        <w:br/>
-      </w:r>
-      <w:r>
-        <w:br/>
-        <w:t>• Venta neta: facturación generada.</w:t>
-      </w:r>
-      <w:r>
-        <w:br/>
-        <w:t>• Venta neta / Meta: cumplimiento</w:t>
-      </w:r>
-      <w:r>
-        <w:t xml:space="preserve"> del objetivo.</w:t>
-      </w:r>
-      <w:r>
-        <w:br/>
-        <w:t>• Ticket promedio: valor promedio de compra.</w:t>
-      </w:r>
-      <w:r>
-        <w:br/>
-        <w:t>• Unidades vendidas: cantidad de productos comercializados.</w:t>
-      </w:r>
-      <w:r>
-        <w:br/>
-      </w:r>
-      <w:r>
-        <w:br/>
-        <w:t>Los colocaría en cuatro tarjetas horizontales para que sean lo primero que observe el usuario.</w:t>
-      </w:r>
-    </w:p>
-    <w:p>
-      <w:pPr>
-        <w:spacing w:after="80"/>
-      </w:pPr>
-      <w:r>
-        <w:rPr>
-          <w:sz w:val="14"/>
-        </w:rPr>
-        <w:lastRenderedPageBreak/>
-        <w:t>────────────────────────────────────────</w:t>
-      </w:r>
-      <w:r>
-        <w:rPr>
-          <w:sz w:val="14"/>
-        </w:rPr>
-        <w:t>──────────────────────────────────────────────────</w:t>
-      </w:r>
-    </w:p>
-    <w:p>
-      <w:pPr>
-        <w:spacing w:after="60"/>
-      </w:pPr>
-      <w:r>
-        <w:rPr>
-          <w:b/>
-        </w:rPr>
-        <w:t>Prompt 3 — Usuario</w:t>
-      </w:r>
-    </w:p>
-    <w:p>
-      <w:pPr>
-        <w:spacing w:after="160"/>
-        <w:ind w:left="360"/>
-      </w:pPr>
-      <w:r>
-        <w:t>Diseñame la estructura visual de un dashboard comercial de una empresa de repuestos automotrices. Quiero una estructura ejecutiva, limpia y fácil de leer. Dividilo en: encabezado, KPI pr</w:t>
-      </w:r>
-      <w:r>
-        <w:t>incipales, segmentadores, análisis temporal, relación entre ventas y unidades y análisis por producto/categoría/clientes.</w:t>
-      </w:r>
-    </w:p>
-    <w:p>
-      <w:pPr>
-        <w:spacing w:after="80"/>
-      </w:pPr>
-      <w:r>
-        <w:rPr>
-          <w:sz w:val="14"/>
-        </w:rPr>
-        <w:t>──────────────────────────────────────────────────────────────────────────────────────────</w:t>
-      </w:r>
-    </w:p>
-    <w:p>
-      <w:pPr>
-        <w:spacing w:after="60"/>
-      </w:pPr>
-      <w:r>
-        <w:rPr>
-          <w:b/>
-        </w:rPr>
-        <w:t>Respuesta — ChatGPT</w:t>
-      </w:r>
-    </w:p>
-    <w:p>
-      <w:pPr>
-        <w:spacing w:after="160"/>
-        <w:ind w:left="360"/>
-      </w:pPr>
-      <w:r>
-        <w:t>Propongo una estructura</w:t>
-      </w:r>
-      <w:r>
-        <w:t xml:space="preserve"> de cinco niveles:</w:t>
-      </w:r>
-      <w:r>
-        <w:br/>
-      </w:r>
-      <w:r>
-        <w:br/>
-        <w:t>1. Encabezado: nombre del dashboard y elementos visuales relacionados con el sector automotriz.</w:t>
-      </w:r>
-      <w:r>
-        <w:br/>
-        <w:t>2. KPI principales: Venta neta | Cumplimiento | Ticket promedio | Unidades.</w:t>
-      </w:r>
-      <w:r>
-        <w:br/>
-        <w:t>3. Segmentadores: Período | Categoría | Región.</w:t>
-      </w:r>
-      <w:r>
-        <w:br/>
-        <w:t>4. Análisis prin</w:t>
-      </w:r>
-      <w:r>
-        <w:t>cipal: venta neta mensual y relación entre unidades y venta neta.</w:t>
-      </w:r>
-      <w:r>
-        <w:br/>
-        <w:t>5. Detalle: participación por producto/categoría, productos y principales compradores.</w:t>
-      </w:r>
-      <w:r>
-        <w:br/>
-      </w:r>
-      <w:r>
-        <w:br/>
-        <w:t>La lectura debería ir de resultado general → tendencia → explicación → detalle.</w:t>
-      </w:r>
-    </w:p>
-    <w:p>
-      <w:pPr>
-        <w:spacing w:after="80"/>
-      </w:pPr>
-      <w:r>
-        <w:rPr>
-          <w:sz w:val="14"/>
-        </w:rPr>
-        <w:t>──────────────────────</w:t>
-      </w:r>
-      <w:r>
-        <w:rPr>
-          <w:sz w:val="14"/>
-        </w:rPr>
-        <w:t>────────────────────────────────────────────────────────────────────</w:t>
-      </w:r>
-    </w:p>
-    <w:p>
-      <w:pPr>
-        <w:spacing w:after="60"/>
-      </w:pPr>
-      <w:r>
-        <w:rPr>
-          <w:b/>
-        </w:rPr>
-        <w:t>Prompt 4 — Usuario</w:t>
-      </w:r>
-    </w:p>
-    <w:p>
-      <w:pPr>
-        <w:spacing w:after="160"/>
-        <w:ind w:left="360"/>
-      </w:pPr>
-      <w:r>
-        <w:t>¿Qué segmentadores debería incorporar para que el usuario pueda explorar el dashboard? La base tiene información temporal, categorías de productos y regiones. Quiero qu</w:t>
-      </w:r>
-      <w:r>
-        <w:t>e los filtros permitan analizar diferentes períodos, categorías y zonas geográficas sin sobrecargar visualmente el tablero.</w:t>
-      </w:r>
-    </w:p>
-    <w:p>
-      <w:pPr>
-        <w:spacing w:after="80"/>
-      </w:pPr>
-      <w:r>
-        <w:rPr>
-          <w:sz w:val="14"/>
-        </w:rPr>
-        <w:t>──────────────────────────────────────────────────────────────────────────────────────────</w:t>
-      </w:r>
-    </w:p>
-    <w:p>
-      <w:pPr>
-        <w:spacing w:after="60"/>
-      </w:pPr>
-      <w:r>
-        <w:rPr>
-          <w:b/>
-        </w:rPr>
-        <w:t>Respuesta — ChatGPT</w:t>
-      </w:r>
-    </w:p>
-    <w:p>
-      <w:pPr>
-        <w:spacing w:after="160"/>
-        <w:ind w:left="360"/>
-      </w:pPr>
-      <w:r>
-        <w:t xml:space="preserve">Utilizaría tres </w:t>
-      </w:r>
-      <w:r>
-        <w:t>segmentadores principales:</w:t>
-      </w:r>
-      <w:r>
-        <w:br/>
-      </w:r>
-      <w:r>
-        <w:br/>
-        <w:t>PERÍODO: ene, feb, mar, abr, may, jun, jul, ago, sept, oct, nov y dic.</w:t>
-      </w:r>
-      <w:r>
-        <w:br/>
-        <w:t>CATEGORÍA: frenos, herramientas y suspensión.</w:t>
-      </w:r>
-      <w:r>
-        <w:br/>
-        <w:t>REGIÓN: NEA y NOA.</w:t>
-      </w:r>
-      <w:r>
-        <w:br/>
-      </w:r>
-      <w:r>
-        <w:br/>
-        <w:t>Los colocaría en una única fila debajo del título “Segmentadores”. Esto permite combinar fi</w:t>
-      </w:r>
-      <w:r>
-        <w:t>ltros, por ejemplo: Octubre + Frenos + NEA, y observar cómo cambian automáticamente los KPI y gráficos.</w:t>
-      </w:r>
-    </w:p>
-    <w:p>
-      <w:pPr>
-        <w:spacing w:after="80"/>
-      </w:pPr>
-      <w:r>
-        <w:rPr>
-          <w:sz w:val="14"/>
-        </w:rPr>
-        <w:t>──────────────────────────────────────────────────────────────────────────────────────────</w:t>
-      </w:r>
-    </w:p>
-    <w:p>
-      <w:pPr>
-        <w:spacing w:after="60"/>
-      </w:pPr>
-      <w:r>
-        <w:rPr>
-          <w:b/>
-        </w:rPr>
-        <w:t>Prompt 5 — Usuario</w:t>
-      </w:r>
-    </w:p>
-    <w:p>
-      <w:pPr>
-        <w:spacing w:after="160"/>
-        <w:ind w:left="360"/>
-      </w:pPr>
-      <w:r>
-        <w:t>Proponeme gráficos para analizar las venta</w:t>
-      </w:r>
-      <w:r>
-        <w:t>s de este negocio. Necesito uno para observar la evolución mensual de la venta neta, otro para analizar la relación entre unidades vendidas y venta neta, otro para visualizar la participación de las categorías/productos y tablas para identificar los princi</w:t>
-      </w:r>
-      <w:r>
-        <w:t>pales productos y compradores. Explicá qué pregunta responde cada visualización.</w:t>
-      </w:r>
-    </w:p>
-    <w:p>
-      <w:pPr>
-        <w:spacing w:after="80"/>
-      </w:pPr>
-      <w:r>
-        <w:rPr>
-          <w:sz w:val="14"/>
-        </w:rPr>
-        <w:t>──────────────────────────────────────────────────────────────────────────────────────────</w:t>
-      </w:r>
-    </w:p>
-    <w:p>
-      <w:pPr>
-        <w:spacing w:after="60"/>
-      </w:pPr>
-      <w:r>
-        <w:rPr>
-          <w:b/>
-        </w:rPr>
-        <w:t>Respuesta — ChatGPT</w:t>
-      </w:r>
-    </w:p>
-    <w:p>
-      <w:pPr>
-        <w:spacing w:after="160"/>
-        <w:ind w:left="360"/>
-      </w:pPr>
-      <w:r>
-        <w:t>Recomiendo cinco visualizaciones:</w:t>
-      </w:r>
-      <w:r>
-        <w:br/>
-      </w:r>
-      <w:r>
-        <w:br/>
-        <w:t>1. Venta neta por mes — gráfi</w:t>
-      </w:r>
-      <w:r>
-        <w:t>co de líneas. Pregunta: ¿Cómo evolucionaron las ventas durante el año?</w:t>
-      </w:r>
-      <w:r>
-        <w:br/>
-        <w:t>2. Unidades vs. venta neta — gráfico de dispersión. Pregunta: ¿Existe una relación entre volumen vendido y facturación?</w:t>
-      </w:r>
-      <w:r>
-        <w:br/>
-      </w:r>
-      <w:r>
-        <w:lastRenderedPageBreak/>
-        <w:t>3. Participación por producto/categoría — gráfico de torta. Pregu</w:t>
-      </w:r>
-      <w:r>
-        <w:t>nta: ¿Qué productos o categorías representan la mayor proporción?</w:t>
-      </w:r>
-      <w:r>
-        <w:br/>
-        <w:t>4. Productos — tabla con producto y unidades.</w:t>
-      </w:r>
-      <w:r>
-        <w:br/>
-        <w:t>5. Compradores — tabla con cliente y unidades.</w:t>
-      </w:r>
-      <w:r>
-        <w:br/>
-      </w:r>
-      <w:r>
-        <w:br/>
-        <w:t>La combinación permite pasar de la tendencia general al detalle.</w:t>
-      </w:r>
-    </w:p>
-    <w:p>
-      <w:pPr>
-        <w:spacing w:after="80"/>
-      </w:pPr>
-      <w:r>
-        <w:rPr>
-          <w:sz w:val="14"/>
-        </w:rPr>
-        <w:t>───────────────────────────────</w:t>
-      </w:r>
-      <w:r>
-        <w:rPr>
-          <w:sz w:val="14"/>
-        </w:rPr>
-        <w:t>───────────────────────────────────────────────────────────</w:t>
-      </w:r>
-    </w:p>
-    <w:p>
-      <w:pPr>
-        <w:spacing w:after="60"/>
-      </w:pPr>
-      <w:r>
-        <w:rPr>
-          <w:b/>
-        </w:rPr>
-        <w:t>Prompt 6 — Usuario</w:t>
-      </w:r>
-    </w:p>
-    <w:p>
-      <w:pPr>
-        <w:spacing w:after="160"/>
-        <w:ind w:left="360"/>
-      </w:pPr>
-      <w:proofErr w:type="spellStart"/>
-      <w:r>
-        <w:t>Analizá</w:t>
-      </w:r>
-      <w:proofErr w:type="spellEnd"/>
-      <w:r>
-        <w:t xml:space="preserve"> </w:t>
-      </w:r>
-      <w:proofErr w:type="spellStart"/>
-      <w:r>
-        <w:t>los</w:t>
-      </w:r>
-      <w:proofErr w:type="spellEnd"/>
-      <w:r>
-        <w:t xml:space="preserve"> </w:t>
-      </w:r>
-      <w:proofErr w:type="spellStart"/>
-      <w:r>
-        <w:t>gráficos</w:t>
-      </w:r>
-      <w:proofErr w:type="spellEnd"/>
-      <w:r>
-        <w:t xml:space="preserve"> </w:t>
-      </w:r>
-      <w:proofErr w:type="gramStart"/>
-      <w:r>
-        <w:t>del</w:t>
-      </w:r>
-      <w:proofErr w:type="gramEnd"/>
-      <w:r>
-        <w:t xml:space="preserve"> dashboard y redactá 3 conclusiones ejecutivas, breves y basadas exclusivamente en los datos. Quiero que identifiques el comportamiento anual de las vent</w:t>
-      </w:r>
-      <w:r>
-        <w:t xml:space="preserve">as, la relación entre volumen y facturación y algún aspecto relevante </w:t>
-      </w:r>
-      <w:proofErr w:type="gramStart"/>
-      <w:r>
-        <w:t>del</w:t>
-      </w:r>
-      <w:proofErr w:type="gramEnd"/>
-      <w:r>
-        <w:t xml:space="preserve"> mix de </w:t>
-      </w:r>
-      <w:proofErr w:type="spellStart"/>
-      <w:r>
-        <w:t>productos</w:t>
-      </w:r>
-      <w:proofErr w:type="spellEnd"/>
-      <w:r>
-        <w:t>.</w:t>
-      </w:r>
-    </w:p>
-    <w:p>
-      <w:pPr>
-        <w:spacing w:after="80"/>
-      </w:pPr>
-      <w:r>
-        <w:rPr>
-          <w:sz w:val="14"/>
-        </w:rPr>
-        <w:t>──────────────────────────────────────────────────────────────────────────────────────────</w:t>
-      </w:r>
-    </w:p>
-    <w:p>
-      <w:pPr>
-        <w:spacing w:after="60"/>
-      </w:pPr>
-      <w:r>
-        <w:rPr>
-          <w:b/>
-        </w:rPr>
-        <w:t>Respuesta — ChatGPT</w:t>
-      </w:r>
-    </w:p>
-    <w:p>
-      <w:pPr>
-        <w:spacing w:after="160"/>
-        <w:ind w:left="360"/>
-      </w:pPr>
-      <w:r>
-        <w:t>A partir de los gráficos, se pueden destacar tres con</w:t>
-      </w:r>
-      <w:r>
-        <w:t>clusiones:</w:t>
-      </w:r>
-      <w:r>
-        <w:br/>
-      </w:r>
-      <w:r>
-        <w:br/>
-        <w:t>1. La venta filtrada suma aproximadamente $31,1 mil millones.</w:t>
-      </w:r>
-      <w:r>
-        <w:br/>
-        <w:t>2. Octubre presenta el mayor nivel de ventas del año, mientras que diciembre finaliza cerca de ese máximo.</w:t>
-      </w:r>
-      <w:r>
-        <w:br/>
-        <w:t>3. Se observa una relación positiva entre unidades vendidas y venta neta, a</w:t>
-      </w:r>
-      <w:r>
-        <w:t>unque conviene revisar los meses alejados de la tendencia y analizar el efecto del precio y del mix de productos.</w:t>
-      </w:r>
-      <w:r>
-        <w:br/>
-      </w:r>
-      <w:r>
-        <w:br/>
-        <w:t>Estas conclusiones deberían interpretarse como una descripción de los datos, no necesariamente como una explicación causal.</w:t>
-      </w:r>
-    </w:p>
-    <w:p>
-      <w:pPr>
-        <w:spacing w:after="80"/>
-      </w:pPr>
-      <w:r>
-        <w:rPr>
-          <w:sz w:val="14"/>
-        </w:rPr>
-        <w:t>─────────────────</w:t>
-      </w:r>
-      <w:r>
-        <w:rPr>
-          <w:sz w:val="14"/>
-        </w:rPr>
-        <w:t>─────────────────────────────────────────────────────────────────────────</w:t>
-      </w:r>
-    </w:p>
-    <w:p>
-      <w:pPr>
-        <w:spacing w:after="60"/>
-      </w:pPr>
-      <w:r>
-        <w:rPr>
-          <w:b/>
-        </w:rPr>
-        <w:t>Prompt 7 — Usuario</w:t>
-      </w:r>
-    </w:p>
-    <w:p>
-      <w:pPr>
-        <w:spacing w:after="160"/>
-        <w:ind w:left="360"/>
-      </w:pPr>
-      <w:r>
-        <w:t>Aplicá un diseño ejecutivo y moderno al dashboard. Utilizá una paleta basada en rojo/bordó, blanco y gris claro. Colocá un encabezado superior oscuro con el nombre</w:t>
-      </w:r>
-      <w:r>
-        <w:t xml:space="preserve"> del dashboard, KPI destacados debajo, segmentadores en una sección independiente y gráficos distribuidos en una grilla. Utilizá títulos cortos, tipografía clara y bordes sutiles. El dashboard debe parecer una herramienta de análisis comercial profesional.</w:t>
-      </w:r>
-    </w:p>
-    <w:p>
-      <w:pPr>
-        <w:spacing w:after="80"/>
-      </w:pPr>
-      <w:r>
-        <w:rPr>
-          <w:sz w:val="14"/>
-        </w:rPr>
-        <w:t>──────────────────────────────────────────────────────────────────────────────────────────</w:t>
-      </w:r>
-    </w:p>
-    <w:p>
-      <w:pPr>
-        <w:spacing w:after="60"/>
-      </w:pPr>
-      <w:proofErr w:type="spellStart"/>
-      <w:r>
-        <w:rPr>
-          <w:b/>
-        </w:rPr>
-        <w:t>Respuesta</w:t>
-      </w:r>
-      <w:proofErr w:type="spellEnd"/>
-      <w:r>
-        <w:rPr>
-          <w:b/>
-        </w:rPr>
-        <w:t xml:space="preserve"> — </w:t>
-      </w:r>
-      <w:proofErr w:type="spellStart"/>
-      <w:r>
-        <w:rPr>
-          <w:b/>
+          <w:lang w:val="es-AR"/>
         </w:rPr>
         <w:t>ChatGPT</w:t>
       </w:r>
@@ -983,54 +384,151 @@
       <w:pPr>
         <w:spacing w:after="160"/>
         <w:ind w:left="360"/>
+        <w:rPr>
+          <w:lang w:val="es-AR"/>
+        </w:rPr>
       </w:pPr>
       <w:r>
-        <w:t>Aplicaría la siguiente identidad visual:</w:t>
-      </w:r>
-      <w:r>
+        <w:rPr>
+          <w:lang w:val="es-AR"/>
+        </w:rPr>
+        <w:t>A partir de la estructura de los datos, las variables pueden organizarse en cinco grupos:</w:t>
+      </w:r>
+      <w:r>
+        <w:rPr>
+          <w:lang w:val="es-AR"/>
+        </w:rPr>
         <w:br/>
       </w:r>
       <w:r>
+        <w:rPr>
+          <w:lang w:val="es-AR"/>
+        </w:rPr>
         <w:br/>
-        <w:t>• Bordó/rojo oscuro: encabezados y títulos de secciones.</w:t>
-      </w:r>
-      <w:r>
+        <w:t>• Variables temporales: mes/período y año.</w:t>
+      </w:r>
+      <w:r>
+        <w:rPr>
+          <w:lang w:val="es-AR"/>
+        </w:rPr>
         <w:br/>
-        <w:t>• Blanco: fondo principal y tarjetas.</w:t>
-      </w:r>
-      <w:r>
+        <w:t>• Variables geográficas: región y, si existe, zona o sucursal.</w:t>
+      </w:r>
+      <w:r>
+        <w:rPr>
+          <w:lang w:val="es-AR"/>
+        </w:rPr>
         <w:br/>
-        <w:t xml:space="preserve">• Gris </w:t>
-      </w:r>
-      <w:r>
-        <w:t>claro: separación entre bloques.</w:t>
-      </w:r>
-      <w:r>
+        <w:t>• Variables comerciales: venta neta, unidades vendidas, ticket promedio y meta de venta.</w:t>
+      </w:r>
+      <w:r>
+        <w:rPr>
+          <w:lang w:val="es-AR"/>
+        </w:rPr>
         <w:br/>
-        <w:t>• Rojo más claro: elementos destacados y gráficos.</w:t>
-      </w:r>
-      <w:r>
+        <w:t>• Variables de producto: categoría, producto/SKU y familia de producto.</w:t>
+      </w:r>
+      <w:r>
+        <w:rPr>
+          <w:lang w:val="es-AR"/>
+        </w:rPr>
         <w:br/>
-        <w:t>• Negro: números principales y texto.</w:t>
-      </w:r>
-      <w:r>
+        <w:t>• Variables de cliente: cliente/comprador y unidades compradas.</w:t>
+      </w:r>
+      <w:r>
+        <w:rPr>
+          <w:lang w:val="es-AR"/>
+        </w:rPr>
         <w:br/>
       </w:r>
       <w:r>
+        <w:rPr>
+          <w:lang w:val="es-AR"/>
+        </w:rPr>
         <w:br/>
-        <w:t>La estructura sería: Encabezado → 4 KPI → Segmentadores → Gráfico de ventas + Scatterplot → Mix de productos + Productos + Compradore</w:t>
-      </w:r>
-      <w:r>
-        <w:t>s.</w:t>
+        <w:t xml:space="preserve">Para el </w:t>
+      </w:r>
+      <w:proofErr w:type="spellStart"/>
+      <w:r>
+        <w:rPr>
+          <w:lang w:val="es-AR"/>
+        </w:rPr>
+        <w:t>dashboard</w:t>
+      </w:r>
+      <w:proofErr w:type="spellEnd"/>
+      <w:r>
+        <w:rPr>
+          <w:lang w:val="es-AR"/>
+        </w:rPr>
+        <w:t xml:space="preserve"> ejecutivo recomiendo enfocarse principalmente en:</w:t>
+      </w:r>
+      <w:r>
+        <w:rPr>
+          <w:lang w:val="es-AR"/>
+        </w:rPr>
+        <w:br/>
+        <w:t>1. Venta neta: permite conocer la facturación generada.</w:t>
+      </w:r>
+      <w:r>
+        <w:rPr>
+          <w:lang w:val="es-AR"/>
+        </w:rPr>
+        <w:br/>
+        <w:t>2. Unidades vendidas: muestra el volumen comercial.</w:t>
+      </w:r>
+      <w:r>
+        <w:rPr>
+          <w:lang w:val="es-AR"/>
+        </w:rPr>
+        <w:br/>
+        <w:t>3. Cumplimiento de meta: permite comparar la venta contra el objetivo.</w:t>
+      </w:r>
+      <w:r>
+        <w:rPr>
+          <w:lang w:val="es-AR"/>
+        </w:rPr>
+        <w:br/>
+        <w:t>4. Ticket/precio promedio: ayuda a distinguir entre crecimiento por volumen y crecimiento por valor.</w:t>
+      </w:r>
+      <w:r>
+        <w:rPr>
+          <w:lang w:val="es-AR"/>
+        </w:rPr>
+        <w:br/>
+      </w:r>
+      <w:r>
+        <w:rPr>
+          <w:lang w:val="es-AR"/>
+        </w:rPr>
+        <w:br/>
+        <w:t xml:space="preserve">El </w:t>
+      </w:r>
+      <w:proofErr w:type="spellStart"/>
+      <w:r>
+        <w:rPr>
+          <w:lang w:val="es-AR"/>
+        </w:rPr>
+        <w:t>dashboard</w:t>
+      </w:r>
+      <w:proofErr w:type="spellEnd"/>
+      <w:r>
+        <w:rPr>
+          <w:lang w:val="es-AR"/>
+        </w:rPr>
+        <w:t xml:space="preserve"> debería permitir analizar estos indicadores por período, categoría y región.</w:t>
       </w:r>
     </w:p>
     <w:p>
       <w:pPr>
         <w:spacing w:after="80"/>
+        <w:rPr>
+          <w:lang w:val="es-AR"/>
+        </w:rPr>
       </w:pPr>
       <w:r>
         <w:rPr>
           <w:sz w:val="14"/>
+          <w:lang w:val="es-AR"/>
         </w:rPr>
         <w:t>──────────────────────────────────────────────────────────────────────────────────────────</w:t>
       </w:r>
@@ -1038,25 +536,134 @@
     <w:p>
       <w:pPr>
         <w:spacing w:after="60"/>
+        <w:rPr>
+          <w:lang w:val="es-AR"/>
+        </w:rPr>
       </w:pPr>
+      <w:proofErr w:type="spellStart"/>
       <w:r>
         <w:rPr>
           <w:b/>
-        </w:rPr>
-        <w:t>Prompt 8</w:t>
-      </w:r>
+          <w:lang w:val="es-AR"/>
+        </w:rPr>
+        <w:t>Prompt</w:t>
+      </w:r>
+      <w:proofErr w:type="spellEnd"/>
       <w:r>
         <w:rPr>
           <w:b/>
-        </w:rPr>
-        <w:t xml:space="preserve"> — </w:t>
+          <w:lang w:val="es-AR"/>
+        </w:rPr>
+        <w:t xml:space="preserve"> 2 — Usuario</w:t>
+      </w:r>
+    </w:p>
+    <w:p>
+      <w:pPr>
+        <w:spacing w:after="160"/>
+        <w:ind w:left="360"/>
+        <w:rPr>
+          <w:lang w:val="es-AR"/>
+        </w:rPr>
+      </w:pPr>
+      <w:r>
+        <w:rPr>
+          <w:lang w:val="es-AR"/>
+        </w:rPr>
+        <w:t xml:space="preserve">A partir de esta base de ventas, </w:t>
       </w:r>
       <w:proofErr w:type="spellStart"/>
       <w:r>
         <w:rPr>
+          <w:lang w:val="es-AR"/>
+        </w:rPr>
+        <w:t>proponeme</w:t>
+      </w:r>
+      <w:proofErr w:type="spellEnd"/>
+      <w:r>
+        <w:rPr>
+          <w:lang w:val="es-AR"/>
+        </w:rPr>
+        <w:t xml:space="preserve"> los KPI más importantes para un </w:t>
+      </w:r>
+      <w:proofErr w:type="spellStart"/>
+      <w:r>
+        <w:rPr>
+          <w:lang w:val="es-AR"/>
+        </w:rPr>
+        <w:t>dashboard</w:t>
+      </w:r>
+      <w:proofErr w:type="spellEnd"/>
+      <w:r>
+        <w:rPr>
+          <w:lang w:val="es-AR"/>
+        </w:rPr>
+        <w:t xml:space="preserve"> comercial. Quiero que sean fáciles de interpretar y que permitan analizar facturación, cumplimiento de objetivos, volumen vendido y comportamiento de los clientes. </w:t>
+      </w:r>
+      <w:proofErr w:type="spellStart"/>
+      <w:r>
+        <w:rPr>
+          <w:lang w:val="es-AR"/>
+        </w:rPr>
+        <w:t>Priorizá</w:t>
+      </w:r>
+      <w:proofErr w:type="spellEnd"/>
+      <w:r>
+        <w:rPr>
+          <w:lang w:val="es-AR"/>
+        </w:rPr>
+        <w:t xml:space="preserve"> 4 KPI principales para colocar en la parte superior del </w:t>
+      </w:r>
+      <w:proofErr w:type="spellStart"/>
+      <w:r>
+        <w:rPr>
+          <w:lang w:val="es-AR"/>
+        </w:rPr>
+        <w:t>dashboard</w:t>
+      </w:r>
+      <w:proofErr w:type="spellEnd"/>
+      <w:r>
+        <w:rPr>
+          <w:lang w:val="es-AR"/>
+        </w:rPr>
+        <w:t>.</w:t>
+      </w:r>
+    </w:p>
+    <w:p>
+      <w:pPr>
+        <w:spacing w:after="80"/>
+        <w:rPr>
+          <w:lang w:val="es-AR"/>
+        </w:rPr>
+      </w:pPr>
+      <w:r>
+        <w:rPr>
+          <w:sz w:val="14"/>
+          <w:lang w:val="es-AR"/>
+        </w:rPr>
+        <w:t>──────────────────────────────────────────────────────────────────────────────────────────</w:t>
+      </w:r>
+    </w:p>
+    <w:p>
+      <w:pPr>
+        <w:spacing w:after="60"/>
+        <w:rPr>
+          <w:lang w:val="es-AR"/>
+        </w:rPr>
+      </w:pPr>
+      <w:r>
+        <w:rPr>
           <w:b/>
-        </w:rPr>
-        <w:t>Usuario</w:t>
+          <w:lang w:val="es-AR"/>
+        </w:rPr>
+        <w:t xml:space="preserve">Respuesta — </w:t>
+      </w:r>
+      <w:proofErr w:type="spellStart"/>
+      <w:r>
+        <w:rPr>
+          <w:b/>
+          <w:lang w:val="es-AR"/>
+        </w:rPr>
+        <w:t>ChatGPT</w:t>
       </w:r>
       <w:proofErr w:type="spellEnd"/>
     </w:p>
@@ -1064,66 +671,754 @@
       <w:pPr>
         <w:spacing w:after="160"/>
         <w:ind w:left="360"/>
+        <w:rPr>
+          <w:lang w:val="es-AR"/>
+        </w:rPr>
       </w:pPr>
       <w:r>
-        <w:t xml:space="preserve">Construí un dashboard ejecutivo de ventas para una empresa de repuestos automotrices utilizando la base </w:t>
-      </w:r>
-      <w:r>
-        <w:t>proporcionada.</w:t>
-      </w:r>
-      <w:r>
+        <w:rPr>
+          <w:lang w:val="es-AR"/>
+        </w:rPr>
+        <w:t xml:space="preserve">Para la parte superior del </w:t>
+      </w:r>
+      <w:proofErr w:type="spellStart"/>
+      <w:r>
+        <w:rPr>
+          <w:lang w:val="es-AR"/>
+        </w:rPr>
+        <w:t>dashboard</w:t>
+      </w:r>
+      <w:proofErr w:type="spellEnd"/>
+      <w:r>
+        <w:rPr>
+          <w:lang w:val="es-AR"/>
+        </w:rPr>
+        <w:t xml:space="preserve"> utilizaría cuatro KPI:</w:t>
+      </w:r>
+      <w:r>
+        <w:rPr>
+          <w:lang w:val="es-AR"/>
+        </w:rPr>
         <w:br/>
       </w:r>
       <w:r>
+        <w:rPr>
+          <w:lang w:val="es-AR"/>
+        </w:rPr>
+        <w:br/>
+        <w:t>• Venta neta: facturación generada.</w:t>
+      </w:r>
+      <w:r>
+        <w:rPr>
+          <w:lang w:val="es-AR"/>
+        </w:rPr>
+        <w:br/>
+        <w:t>• Venta neta / Meta: cumplimiento del objetivo.</w:t>
+      </w:r>
+      <w:r>
+        <w:rPr>
+          <w:lang w:val="es-AR"/>
+        </w:rPr>
+        <w:br/>
+        <w:t>• Ticket promedio: valor promedio de compra.</w:t>
+      </w:r>
+      <w:r>
+        <w:rPr>
+          <w:lang w:val="es-AR"/>
+        </w:rPr>
+        <w:br/>
+        <w:t>• Unidades vendidas: cantidad de productos comercializados.</w:t>
+      </w:r>
+      <w:r>
+        <w:rPr>
+          <w:lang w:val="es-AR"/>
+        </w:rPr>
+        <w:br/>
+      </w:r>
+      <w:r>
+        <w:rPr>
+          <w:lang w:val="es-AR"/>
+        </w:rPr>
         <w:lastRenderedPageBreak/>
         <w:br/>
-        <w:t>Debe incluir:</w:t>
-      </w:r>
-      <w:r>
+        <w:t>Los colocaría en cuatro tarjetas horizontales para que sean lo primero que observe el usuario.</w:t>
+      </w:r>
+    </w:p>
+    <w:p>
+      <w:pPr>
+        <w:spacing w:after="80"/>
+        <w:rPr>
+          <w:lang w:val="es-AR"/>
+        </w:rPr>
+      </w:pPr>
+      <w:r>
+        <w:rPr>
+          <w:sz w:val="14"/>
+          <w:lang w:val="es-AR"/>
+        </w:rPr>
+        <w:t>──────────────────────────────────────────────────────────────────────────────────────────</w:t>
+      </w:r>
+    </w:p>
+    <w:p>
+      <w:pPr>
+        <w:spacing w:after="60"/>
+        <w:rPr>
+          <w:lang w:val="es-AR"/>
+        </w:rPr>
+      </w:pPr>
+      <w:proofErr w:type="spellStart"/>
+      <w:r>
+        <w:rPr>
+          <w:b/>
+          <w:lang w:val="es-AR"/>
+        </w:rPr>
+        <w:t>Prompt</w:t>
+      </w:r>
+      <w:proofErr w:type="spellEnd"/>
+      <w:r>
+        <w:rPr>
+          <w:b/>
+          <w:lang w:val="es-AR"/>
+        </w:rPr>
+        <w:t xml:space="preserve"> 3 — Usuario</w:t>
+      </w:r>
+    </w:p>
+    <w:p>
+      <w:pPr>
+        <w:spacing w:after="160"/>
+        <w:ind w:left="360"/>
+        <w:rPr>
+          <w:lang w:val="es-AR"/>
+        </w:rPr>
+      </w:pPr>
+      <w:proofErr w:type="spellStart"/>
+      <w:r>
+        <w:rPr>
+          <w:lang w:val="es-AR"/>
+        </w:rPr>
+        <w:t>Diseñame</w:t>
+      </w:r>
+      <w:proofErr w:type="spellEnd"/>
+      <w:r>
+        <w:rPr>
+          <w:lang w:val="es-AR"/>
+        </w:rPr>
+        <w:t xml:space="preserve"> la estructura visual de un </w:t>
+      </w:r>
+      <w:proofErr w:type="spellStart"/>
+      <w:r>
+        <w:rPr>
+          <w:lang w:val="es-AR"/>
+        </w:rPr>
+        <w:t>dashboard</w:t>
+      </w:r>
+      <w:proofErr w:type="spellEnd"/>
+      <w:r>
+        <w:rPr>
+          <w:lang w:val="es-AR"/>
+        </w:rPr>
+        <w:t xml:space="preserve"> comercial de una empresa de repuestos automotrices. Quiero una estructura ejecutiva, limpia y fácil de leer. </w:t>
+      </w:r>
+      <w:proofErr w:type="spellStart"/>
+      <w:r>
+        <w:rPr>
+          <w:lang w:val="es-AR"/>
+        </w:rPr>
+        <w:t>Dividilo</w:t>
+      </w:r>
+      <w:proofErr w:type="spellEnd"/>
+      <w:r>
+        <w:rPr>
+          <w:lang w:val="es-AR"/>
+        </w:rPr>
+        <w:t xml:space="preserve"> en: encabezado, KPI principales, </w:t>
+      </w:r>
+      <w:proofErr w:type="spellStart"/>
+      <w:r>
+        <w:rPr>
+          <w:lang w:val="es-AR"/>
+        </w:rPr>
+        <w:t>segmentadores</w:t>
+      </w:r>
+      <w:proofErr w:type="spellEnd"/>
+      <w:r>
+        <w:rPr>
+          <w:lang w:val="es-AR"/>
+        </w:rPr>
+        <w:t>, análisis temporal, relación entre ventas y unidades y análisis por producto/categoría/clientes.</w:t>
+      </w:r>
+    </w:p>
+    <w:p>
+      <w:pPr>
+        <w:spacing w:after="80"/>
+        <w:rPr>
+          <w:lang w:val="es-AR"/>
+        </w:rPr>
+      </w:pPr>
+      <w:r>
+        <w:rPr>
+          <w:sz w:val="14"/>
+          <w:lang w:val="es-AR"/>
+        </w:rPr>
+        <w:t>──────────────────────────────────────────────────────────────────────────────────────────</w:t>
+      </w:r>
+    </w:p>
+    <w:p>
+      <w:pPr>
+        <w:spacing w:after="60"/>
+        <w:rPr>
+          <w:lang w:val="es-AR"/>
+        </w:rPr>
+      </w:pPr>
+      <w:r>
+        <w:rPr>
+          <w:b/>
+          <w:lang w:val="es-AR"/>
+        </w:rPr>
+        <w:t xml:space="preserve">Respuesta — </w:t>
+      </w:r>
+      <w:proofErr w:type="spellStart"/>
+      <w:r>
+        <w:rPr>
+          <w:b/>
+          <w:lang w:val="es-AR"/>
+        </w:rPr>
+        <w:t>ChatGPT</w:t>
+      </w:r>
+      <w:proofErr w:type="spellEnd"/>
+    </w:p>
+    <w:p>
+      <w:pPr>
+        <w:spacing w:after="160"/>
+        <w:ind w:left="360"/>
+        <w:rPr>
+          <w:lang w:val="es-AR"/>
+        </w:rPr>
+      </w:pPr>
+      <w:r>
+        <w:rPr>
+          <w:lang w:val="es-AR"/>
+        </w:rPr>
+        <w:t>Propongo una estructura de cinco niveles:</w:t>
+      </w:r>
+      <w:r>
+        <w:rPr>
+          <w:lang w:val="es-AR"/>
+        </w:rPr>
         <w:br/>
-        <w:t>- un encabezado con el nombre del dashboard;</w:t>
-      </w:r>
-      <w:r>
+      </w:r>
+      <w:r>
+        <w:rPr>
+          <w:lang w:val="es-AR"/>
+        </w:rPr>
         <w:br/>
-        <w:t>- 4 KPI principales: venta neta, cumplimiento de meta, ticket promedio y unidades vendidas;</w:t>
-      </w:r>
-      <w:r>
+        <w:t xml:space="preserve">1. Encabezado: nombre del </w:t>
+      </w:r>
+      <w:proofErr w:type="spellStart"/>
+      <w:r>
+        <w:rPr>
+          <w:lang w:val="es-AR"/>
+        </w:rPr>
+        <w:t>dashboard</w:t>
+      </w:r>
+      <w:proofErr w:type="spellEnd"/>
+      <w:r>
+        <w:rPr>
+          <w:lang w:val="es-AR"/>
+        </w:rPr>
+        <w:t xml:space="preserve"> y elementos visuales relacionados con el sector automotriz.</w:t>
+      </w:r>
+      <w:r>
+        <w:rPr>
+          <w:lang w:val="es-AR"/>
+        </w:rPr>
         <w:br/>
-        <w:t>- segmentadores de período, categoría y región;</w:t>
-      </w:r>
-      <w:r>
+        <w:t>2. KPI principales: Venta neta | Cumplimiento | Ticket promedio | Unidades.</w:t>
+      </w:r>
+      <w:r>
+        <w:rPr>
+          <w:lang w:val="es-AR"/>
+        </w:rPr>
         <w:br/>
-        <w:t>- gráfico de línea de venta neta mensual;</w:t>
-      </w:r>
-      <w:r>
+        <w:t xml:space="preserve">3. </w:t>
+      </w:r>
+      <w:proofErr w:type="spellStart"/>
+      <w:r>
+        <w:rPr>
+          <w:lang w:val="es-AR"/>
+        </w:rPr>
+        <w:t>Segmentadores</w:t>
+      </w:r>
+      <w:proofErr w:type="spellEnd"/>
+      <w:r>
+        <w:rPr>
+          <w:lang w:val="es-AR"/>
+        </w:rPr>
+        <w:t>: Período | Categoría | Región.</w:t>
+      </w:r>
+      <w:r>
+        <w:rPr>
+          <w:lang w:val="es-AR"/>
+        </w:rPr>
         <w:br/>
-        <w:t>- scatterplot de unidades vendidas vs. venta neta;</w:t>
-      </w:r>
-      <w:r>
+        <w:t>4. Análisis principal: venta neta mensual y relación entre unidades y venta neta.</w:t>
+      </w:r>
+      <w:r>
+        <w:rPr>
+          <w:lang w:val="es-AR"/>
+        </w:rPr>
         <w:br/>
-        <w:t>- gráfico de participación por producto/categoría;</w:t>
-      </w:r>
-      <w:r>
+        <w:t>5. Detalle: participación por producto/categoría, productos y principales compradores.</w:t>
+      </w:r>
+      <w:r>
+        <w:rPr>
+          <w:lang w:val="es-AR"/>
+        </w:rPr>
         <w:br/>
-        <w:t>- tabla de productos con unidades vendidas;</w:t>
-      </w:r>
-      <w:r>
+      </w:r>
+      <w:r>
+        <w:rPr>
+          <w:lang w:val="es-AR"/>
+        </w:rPr>
         <w:br/>
-        <w:t>- tabla de principales compradores;</w:t>
-      </w:r>
-      <w:r>
+        <w:t>La lectura debería ir de resultado general → tendencia → explicación → detalle.</w:t>
+      </w:r>
+    </w:p>
+    <w:p>
+      <w:pPr>
+        <w:spacing w:after="80"/>
+        <w:rPr>
+          <w:lang w:val="es-AR"/>
+        </w:rPr>
+      </w:pPr>
+      <w:r>
+        <w:rPr>
+          <w:sz w:val="14"/>
+          <w:lang w:val="es-AR"/>
+        </w:rPr>
+        <w:t>──────────────────────────────────────────────────────────────────────────────────────────</w:t>
+      </w:r>
+    </w:p>
+    <w:p>
+      <w:pPr>
+        <w:spacing w:after="60"/>
+        <w:rPr>
+          <w:lang w:val="es-AR"/>
+        </w:rPr>
+      </w:pPr>
+      <w:proofErr w:type="spellStart"/>
+      <w:r>
+        <w:rPr>
+          <w:b/>
+          <w:lang w:val="es-AR"/>
+        </w:rPr>
+        <w:t>Prompt</w:t>
+      </w:r>
+      <w:proofErr w:type="spellEnd"/>
+      <w:r>
+        <w:rPr>
+          <w:b/>
+          <w:lang w:val="es-AR"/>
+        </w:rPr>
+        <w:t xml:space="preserve"> 4 — Usuario</w:t>
+      </w:r>
+    </w:p>
+    <w:p>
+      <w:pPr>
+        <w:spacing w:after="160"/>
+        <w:ind w:left="360"/>
+        <w:rPr>
+          <w:lang w:val="es-AR"/>
+        </w:rPr>
+      </w:pPr>
+      <w:r>
+        <w:rPr>
+          <w:lang w:val="es-AR"/>
+        </w:rPr>
+        <w:t xml:space="preserve">¿Qué </w:t>
+      </w:r>
+      <w:proofErr w:type="spellStart"/>
+      <w:r>
+        <w:rPr>
+          <w:lang w:val="es-AR"/>
+        </w:rPr>
+        <w:t>segmentadores</w:t>
+      </w:r>
+      <w:proofErr w:type="spellEnd"/>
+      <w:r>
+        <w:rPr>
+          <w:lang w:val="es-AR"/>
+        </w:rPr>
+        <w:t xml:space="preserve"> debería incorporar para que el usuario pueda explorar el </w:t>
+      </w:r>
+      <w:proofErr w:type="spellStart"/>
+      <w:r>
+        <w:rPr>
+          <w:lang w:val="es-AR"/>
+        </w:rPr>
+        <w:t>dashboard</w:t>
+      </w:r>
+      <w:proofErr w:type="spellEnd"/>
+      <w:r>
+        <w:rPr>
+          <w:lang w:val="es-AR"/>
+        </w:rPr>
+        <w:t>? La base tiene información temporal, categorías de productos y regiones. Quiero que los filtros permitan analizar diferentes períodos, categorías y zonas geográficas sin sobrecargar visualmente el tablero.</w:t>
+      </w:r>
+    </w:p>
+    <w:p>
+      <w:pPr>
+        <w:spacing w:after="80"/>
+        <w:rPr>
+          <w:lang w:val="es-AR"/>
+        </w:rPr>
+      </w:pPr>
+      <w:r>
+        <w:rPr>
+          <w:sz w:val="14"/>
+          <w:lang w:val="es-AR"/>
+        </w:rPr>
+        <w:t>──────────────────────────────────────────────────────────────────────────────────────────</w:t>
+      </w:r>
+    </w:p>
+    <w:p>
+      <w:pPr>
+        <w:spacing w:after="60"/>
+        <w:rPr>
+          <w:lang w:val="es-AR"/>
+        </w:rPr>
+      </w:pPr>
+      <w:r>
+        <w:rPr>
+          <w:b/>
+          <w:lang w:val="es-AR"/>
+        </w:rPr>
+        <w:t xml:space="preserve">Respuesta — </w:t>
+      </w:r>
+      <w:proofErr w:type="spellStart"/>
+      <w:r>
+        <w:rPr>
+          <w:b/>
+          <w:lang w:val="es-AR"/>
+        </w:rPr>
+        <w:t>ChatGPT</w:t>
+      </w:r>
+      <w:proofErr w:type="spellEnd"/>
+    </w:p>
+    <w:p>
+      <w:pPr>
+        <w:spacing w:after="160"/>
+        <w:ind w:left="360"/>
+        <w:rPr>
+          <w:lang w:val="es-AR"/>
+        </w:rPr>
+      </w:pPr>
+      <w:r>
+        <w:rPr>
+          <w:lang w:val="es-AR"/>
+        </w:rPr>
+        <w:t xml:space="preserve">Utilizaría tres </w:t>
+      </w:r>
+      <w:proofErr w:type="spellStart"/>
+      <w:r>
+        <w:rPr>
+          <w:lang w:val="es-AR"/>
+        </w:rPr>
+        <w:t>segmentadores</w:t>
+      </w:r>
+      <w:proofErr w:type="spellEnd"/>
+      <w:r>
+        <w:rPr>
+          <w:lang w:val="es-AR"/>
+        </w:rPr>
+        <w:t xml:space="preserve"> principales:</w:t>
+      </w:r>
+      <w:r>
+        <w:rPr>
+          <w:lang w:val="es-AR"/>
+        </w:rPr>
         <w:br/>
-        <w:t>- conclusiones ejecutivas basadas en los datos.</w:t>
-      </w:r>
-      <w:r>
+      </w:r>
+      <w:r>
+        <w:rPr>
+          <w:lang w:val="es-AR"/>
+        </w:rPr>
         <w:br/>
-      </w:r>
-      <w:r>
+        <w:t xml:space="preserve">PERÍODO: ene, feb, mar, abr, </w:t>
+      </w:r>
+      <w:proofErr w:type="spellStart"/>
+      <w:r>
+        <w:rPr>
+          <w:lang w:val="es-AR"/>
+        </w:rPr>
+        <w:t>may</w:t>
+      </w:r>
+      <w:proofErr w:type="spellEnd"/>
+      <w:r>
+        <w:rPr>
+          <w:lang w:val="es-AR"/>
+        </w:rPr>
+        <w:t xml:space="preserve">, jun, jul, </w:t>
+      </w:r>
+      <w:proofErr w:type="spellStart"/>
+      <w:r>
+        <w:rPr>
+          <w:lang w:val="es-AR"/>
+        </w:rPr>
+        <w:t>ago</w:t>
+      </w:r>
+      <w:proofErr w:type="spellEnd"/>
+      <w:r>
+        <w:rPr>
+          <w:lang w:val="es-AR"/>
+        </w:rPr>
+        <w:t xml:space="preserve">, sept, oct, nov y </w:t>
+      </w:r>
+      <w:proofErr w:type="spellStart"/>
+      <w:r>
+        <w:rPr>
+          <w:lang w:val="es-AR"/>
+        </w:rPr>
+        <w:t>dic</w:t>
+      </w:r>
+      <w:proofErr w:type="spellEnd"/>
+      <w:r>
+        <w:rPr>
+          <w:lang w:val="es-AR"/>
+        </w:rPr>
+        <w:t>.</w:t>
+      </w:r>
+      <w:r>
+        <w:rPr>
+          <w:lang w:val="es-AR"/>
+        </w:rPr>
         <w:br/>
-        <w:t>Utilizá una estética pro</w:t>
-      </w:r>
-      <w:r>
-        <w:t>fesional de empresa automotriz, con predominio de bordó/rojo, blanco y gris. Priorizá la legibilidad y organizá la información de mayor a menor nivel ejecutivo.</w:t>
+        <w:t>CATEGORÍA: frenos, herramientas y suspensión.</w:t>
+      </w:r>
+      <w:r>
+        <w:rPr>
+          <w:lang w:val="es-AR"/>
+        </w:rPr>
+        <w:br/>
+        <w:t>REGIÓN: NEA y NOA.</w:t>
+      </w:r>
+      <w:r>
+        <w:rPr>
+          <w:lang w:val="es-AR"/>
+        </w:rPr>
+        <w:br/>
+      </w:r>
+      <w:r>
+        <w:rPr>
+          <w:lang w:val="es-AR"/>
+        </w:rPr>
+        <w:br/>
+        <w:t>Los colocaría en una única fila debajo del título “</w:t>
+      </w:r>
+      <w:proofErr w:type="spellStart"/>
+      <w:r>
+        <w:rPr>
+          <w:lang w:val="es-AR"/>
+        </w:rPr>
+        <w:t>Segmentadores</w:t>
+      </w:r>
+      <w:proofErr w:type="spellEnd"/>
+      <w:r>
+        <w:rPr>
+          <w:lang w:val="es-AR"/>
+        </w:rPr>
+        <w:t>”. Esto permite combinar filtros, por ejemplo: Octubre + Frenos + NEA, y observar cómo cambian automáticamente los KPI y gráficos.</w:t>
+      </w:r>
+    </w:p>
+    <w:p>
+      <w:pPr>
+        <w:spacing w:after="80"/>
+        <w:rPr>
+          <w:lang w:val="es-AR"/>
+        </w:rPr>
+      </w:pPr>
+      <w:r>
+        <w:rPr>
+          <w:sz w:val="14"/>
+          <w:lang w:val="es-AR"/>
+        </w:rPr>
+        <w:t>──────────────────────────────────────────────────────────────────────────────────────────</w:t>
+      </w:r>
+    </w:p>
+    <w:p>
+      <w:pPr>
+        <w:spacing w:after="60"/>
+        <w:rPr>
+          <w:lang w:val="es-AR"/>
+        </w:rPr>
+      </w:pPr>
+      <w:proofErr w:type="spellStart"/>
+      <w:r>
+        <w:rPr>
+          <w:b/>
+          <w:lang w:val="es-AR"/>
+        </w:rPr>
+        <w:t>Prompt</w:t>
+      </w:r>
+      <w:proofErr w:type="spellEnd"/>
+      <w:r>
+        <w:rPr>
+          <w:b/>
+          <w:lang w:val="es-AR"/>
+        </w:rPr>
+        <w:t xml:space="preserve"> 5 — Usuario</w:t>
+      </w:r>
+    </w:p>
+    <w:p>
+      <w:pPr>
+        <w:spacing w:after="160"/>
+        <w:ind w:left="360"/>
+        <w:rPr>
+          <w:lang w:val="es-AR"/>
+        </w:rPr>
+      </w:pPr>
+      <w:proofErr w:type="spellStart"/>
+      <w:r>
+        <w:rPr>
+          <w:lang w:val="es-AR"/>
+        </w:rPr>
+        <w:t>Proponeme</w:t>
+      </w:r>
+      <w:proofErr w:type="spellEnd"/>
+      <w:r>
+        <w:rPr>
+          <w:lang w:val="es-AR"/>
+        </w:rPr>
+        <w:t xml:space="preserve"> gráficos para analizar las ventas de este negocio. Necesito uno para observar la evolución mensual de la venta neta, otro para analizar la relación entre unidades vendidas y venta neta, otro para visualizar la participación de las categorías/productos y tablas para identificar los principales productos y compradores. </w:t>
+      </w:r>
+      <w:proofErr w:type="spellStart"/>
+      <w:r>
+        <w:rPr>
+          <w:lang w:val="es-AR"/>
+        </w:rPr>
+        <w:t>Explicá</w:t>
+      </w:r>
+      <w:proofErr w:type="spellEnd"/>
+      <w:r>
+        <w:rPr>
+          <w:lang w:val="es-AR"/>
+        </w:rPr>
+        <w:t xml:space="preserve"> qué pregunta responde cada visualización.</w:t>
+      </w:r>
+    </w:p>
+    <w:p>
+      <w:pPr>
+        <w:spacing w:after="80"/>
+        <w:rPr>
+          <w:lang w:val="es-AR"/>
+        </w:rPr>
+      </w:pPr>
+      <w:r>
+        <w:rPr>
+          <w:sz w:val="14"/>
+          <w:lang w:val="es-AR"/>
+        </w:rPr>
+        <w:t>──────────────────────────────────────────────────────────────────────────────────────────</w:t>
+      </w:r>
+    </w:p>
+    <w:p>
+      <w:pPr>
+        <w:spacing w:after="60"/>
+        <w:rPr>
+          <w:lang w:val="es-AR"/>
+        </w:rPr>
+      </w:pPr>
+      <w:r>
+        <w:rPr>
+          <w:b/>
+          <w:lang w:val="es-AR"/>
+        </w:rPr>
+        <w:t xml:space="preserve">Respuesta — </w:t>
+      </w:r>
+      <w:proofErr w:type="spellStart"/>
+      <w:r>
+        <w:rPr>
+          <w:b/>
+          <w:lang w:val="es-AR"/>
+        </w:rPr>
+        <w:t>ChatGPT</w:t>
+      </w:r>
+      <w:proofErr w:type="spellEnd"/>
+    </w:p>
+    <w:p>
+      <w:pPr>
+        <w:spacing w:after="160"/>
+        <w:ind w:left="360"/>
+        <w:rPr>
+          <w:lang w:val="es-AR"/>
+        </w:rPr>
+      </w:pPr>
+      <w:r>
+        <w:rPr>
+          <w:lang w:val="es-AR"/>
+        </w:rPr>
+        <w:t>Recomiendo cinco visualizaciones:</w:t>
+      </w:r>
+      <w:r>
+        <w:rPr>
+          <w:lang w:val="es-AR"/>
+        </w:rPr>
+        <w:br/>
+      </w:r>
+      <w:r>
+        <w:rPr>
+          <w:lang w:val="es-AR"/>
+        </w:rPr>
+        <w:br/>
+        <w:t xml:space="preserve">1. Venta neta por mes — gráfico de líneas. Pregunta: ¿Cómo evolucionaron las ventas durante el </w:t>
+      </w:r>
+      <w:r>
+        <w:rPr>
+          <w:lang w:val="es-AR"/>
+        </w:rPr>
+        <w:lastRenderedPageBreak/>
+        <w:t>año?</w:t>
+      </w:r>
+      <w:r>
+        <w:rPr>
+          <w:lang w:val="es-AR"/>
+        </w:rPr>
+        <w:br/>
+        <w:t>2. Unidades vs. venta neta — gráfico de dispersión. Pregunta: ¿Existe una relación entre volumen vendido y facturación?</w:t>
+      </w:r>
+      <w:r>
+        <w:rPr>
+          <w:lang w:val="es-AR"/>
+        </w:rPr>
+        <w:br/>
+        <w:t>3. Participación por producto/categoría — gráfico de torta. Pregunta: ¿Qué productos o categorías representan la mayor proporción?</w:t>
+      </w:r>
+      <w:r>
+        <w:rPr>
+          <w:lang w:val="es-AR"/>
+        </w:rPr>
+        <w:br/>
+        <w:t>4. Productos — tabla con producto y unidades.</w:t>
+      </w:r>
+      <w:r>
+        <w:rPr>
+          <w:lang w:val="es-AR"/>
+        </w:rPr>
+        <w:br/>
+        <w:t>5. Compradores — tabla con cliente y unidades.</w:t>
+      </w:r>
+      <w:r>
+        <w:rPr>
+          <w:lang w:val="es-AR"/>
+        </w:rPr>
+        <w:br/>
+      </w:r>
+      <w:r>
+        <w:rPr>
+          <w:lang w:val="es-AR"/>
+        </w:rPr>
+        <w:br/>
+        <w:t>La combinación permite pasar de la tendencia general al detalle.</w:t>
       </w:r>
     </w:p>
     <w:p>
@@ -1145,98 +1440,867 @@
         <w:rPr>
           <w:b/>
         </w:rPr>
-        <w:t>Resp</w:t>
-      </w:r>
-      <w:r>
-        <w:rPr>
-          <w:b/>
-        </w:rPr>
-        <w:t>uesta — ChatGPT</w:t>
+        <w:t>Prompt 6 — Usuario</w:t>
       </w:r>
     </w:p>
     <w:p>
       <w:pPr>
         <w:spacing w:after="160"/>
         <w:ind w:left="360"/>
+        <w:rPr>
+          <w:lang w:val="es-AR"/>
+        </w:rPr>
       </w:pPr>
-      <w:r>
+      <w:proofErr w:type="spellStart"/>
+      <w:r>
+        <w:rPr>
+          <w:lang w:val="es-AR"/>
+        </w:rPr>
+        <w:t>Analizá</w:t>
+      </w:r>
+      <w:proofErr w:type="spellEnd"/>
+      <w:r>
+        <w:rPr>
+          <w:lang w:val="es-AR"/>
+        </w:rPr>
+        <w:t xml:space="preserve"> los gráficos del </w:t>
+      </w:r>
+      <w:proofErr w:type="spellStart"/>
+      <w:r>
+        <w:rPr>
+          <w:lang w:val="es-AR"/>
+        </w:rPr>
+        <w:t>dashboard</w:t>
+      </w:r>
+      <w:proofErr w:type="spellEnd"/>
+      <w:r>
+        <w:rPr>
+          <w:lang w:val="es-AR"/>
+        </w:rPr>
+        <w:t xml:space="preserve"> y </w:t>
+      </w:r>
+      <w:proofErr w:type="spellStart"/>
+      <w:r>
+        <w:rPr>
+          <w:lang w:val="es-AR"/>
+        </w:rPr>
+        <w:t>redactá</w:t>
+      </w:r>
+      <w:proofErr w:type="spellEnd"/>
+      <w:r>
+        <w:rPr>
+          <w:lang w:val="es-AR"/>
+        </w:rPr>
+        <w:t xml:space="preserve"> 3 conclusiones ejecutivas, breves y basadas exclusivamente en los datos. Quiero que identifiques el comportamiento anual de las ventas, la relación entre volumen y facturación y algún aspecto relevante del </w:t>
+      </w:r>
+      <w:proofErr w:type="spellStart"/>
+      <w:r>
+        <w:rPr>
+          <w:lang w:val="es-AR"/>
+        </w:rPr>
+        <w:t>mix</w:t>
+      </w:r>
+      <w:proofErr w:type="spellEnd"/>
+      <w:r>
+        <w:rPr>
+          <w:lang w:val="es-AR"/>
+        </w:rPr>
+        <w:t xml:space="preserve"> de productos.</w:t>
+      </w:r>
+    </w:p>
+    <w:p>
+      <w:pPr>
+        <w:spacing w:after="80"/>
+        <w:rPr>
+          <w:lang w:val="es-AR"/>
+        </w:rPr>
+      </w:pPr>
+      <w:r>
+        <w:rPr>
+          <w:sz w:val="14"/>
+          <w:lang w:val="es-AR"/>
+        </w:rPr>
+        <w:t>──────────────────────────────────────────────────────────────────────────────────────────</w:t>
+      </w:r>
+    </w:p>
+    <w:p>
+      <w:pPr>
+        <w:spacing w:after="60"/>
+        <w:rPr>
+          <w:lang w:val="es-AR"/>
+        </w:rPr>
+      </w:pPr>
+      <w:r>
+        <w:rPr>
+          <w:b/>
+          <w:lang w:val="es-AR"/>
+        </w:rPr>
+        <w:t xml:space="preserve">Respuesta — </w:t>
+      </w:r>
+      <w:proofErr w:type="spellStart"/>
+      <w:r>
+        <w:rPr>
+          <w:b/>
+          <w:lang w:val="es-AR"/>
+        </w:rPr>
+        <w:t>ChatGPT</w:t>
+      </w:r>
+      <w:proofErr w:type="spellEnd"/>
+    </w:p>
+    <w:p>
+      <w:pPr>
+        <w:spacing w:after="160"/>
+        <w:ind w:left="360"/>
+        <w:rPr>
+          <w:lang w:val="es-AR"/>
+        </w:rPr>
+      </w:pPr>
+      <w:r>
+        <w:rPr>
+          <w:lang w:val="es-AR"/>
+        </w:rPr>
+        <w:t>A partir de los gráficos, se pueden destacar tres conclusiones:</w:t>
+      </w:r>
+      <w:r>
+        <w:rPr>
+          <w:lang w:val="es-AR"/>
+        </w:rPr>
+        <w:br/>
+      </w:r>
+      <w:r>
+        <w:rPr>
+          <w:lang w:val="es-AR"/>
+        </w:rPr>
+        <w:br/>
+        <w:t>1. La venta filtrada suma aproximadamente $31,1 mil millones.</w:t>
+      </w:r>
+      <w:r>
+        <w:rPr>
+          <w:lang w:val="es-AR"/>
+        </w:rPr>
+        <w:br/>
+        <w:t>2. Octubre presenta el mayor nivel de ventas del año, mientras que diciembre finaliza cerca de ese máximo.</w:t>
+      </w:r>
+      <w:r>
+        <w:rPr>
+          <w:lang w:val="es-AR"/>
+        </w:rPr>
+        <w:br/>
+        <w:t xml:space="preserve">3. Se observa una relación positiva entre unidades vendidas y venta neta, aunque conviene revisar los meses alejados de la tendencia y analizar el efecto del precio y del </w:t>
+      </w:r>
+      <w:proofErr w:type="spellStart"/>
+      <w:r>
+        <w:rPr>
+          <w:lang w:val="es-AR"/>
+        </w:rPr>
+        <w:t>mix</w:t>
+      </w:r>
+      <w:proofErr w:type="spellEnd"/>
+      <w:r>
+        <w:rPr>
+          <w:lang w:val="es-AR"/>
+        </w:rPr>
+        <w:t xml:space="preserve"> de productos.</w:t>
+      </w:r>
+      <w:r>
+        <w:rPr>
+          <w:lang w:val="es-AR"/>
+        </w:rPr>
+        <w:br/>
+      </w:r>
+      <w:r>
+        <w:rPr>
+          <w:lang w:val="es-AR"/>
+        </w:rPr>
+        <w:br/>
+        <w:t>Estas conclusiones deberían interpretarse como una descripción de los datos, no necesariamente como una explicación causal.</w:t>
+      </w:r>
+    </w:p>
+    <w:p>
+      <w:pPr>
+        <w:spacing w:after="80"/>
+        <w:rPr>
+          <w:lang w:val="es-AR"/>
+        </w:rPr>
+      </w:pPr>
+      <w:r>
+        <w:rPr>
+          <w:sz w:val="14"/>
+          <w:lang w:val="es-AR"/>
+        </w:rPr>
+        <w:t>──────────────────────────────────────────────────────────────────────────────────────────</w:t>
+      </w:r>
+    </w:p>
+    <w:p>
+      <w:pPr>
+        <w:spacing w:after="60"/>
+        <w:rPr>
+          <w:lang w:val="es-AR"/>
+        </w:rPr>
+      </w:pPr>
+      <w:proofErr w:type="spellStart"/>
+      <w:r>
+        <w:rPr>
+          <w:b/>
+          <w:lang w:val="es-AR"/>
+        </w:rPr>
+        <w:t>Prompt</w:t>
+      </w:r>
+      <w:proofErr w:type="spellEnd"/>
+      <w:r>
+        <w:rPr>
+          <w:b/>
+          <w:lang w:val="es-AR"/>
+        </w:rPr>
+        <w:t xml:space="preserve"> 7 — Usuario</w:t>
+      </w:r>
+    </w:p>
+    <w:p>
+      <w:pPr>
+        <w:spacing w:after="160"/>
+        <w:ind w:left="360"/>
+        <w:rPr>
+          <w:lang w:val="es-AR"/>
+        </w:rPr>
+      </w:pPr>
+      <w:proofErr w:type="spellStart"/>
+      <w:r>
+        <w:rPr>
+          <w:lang w:val="es-AR"/>
+        </w:rPr>
+        <w:t>Aplicá</w:t>
+      </w:r>
+      <w:proofErr w:type="spellEnd"/>
+      <w:r>
+        <w:rPr>
+          <w:lang w:val="es-AR"/>
+        </w:rPr>
+        <w:t xml:space="preserve"> un diseño ejecutivo y moderno al </w:t>
+      </w:r>
+      <w:proofErr w:type="spellStart"/>
+      <w:r>
+        <w:rPr>
+          <w:lang w:val="es-AR"/>
+        </w:rPr>
+        <w:t>dashboard</w:t>
+      </w:r>
+      <w:proofErr w:type="spellEnd"/>
+      <w:r>
+        <w:rPr>
+          <w:lang w:val="es-AR"/>
+        </w:rPr>
+        <w:t xml:space="preserve">. </w:t>
+      </w:r>
+      <w:proofErr w:type="spellStart"/>
+      <w:r>
+        <w:rPr>
+          <w:lang w:val="es-AR"/>
+        </w:rPr>
+        <w:t>Utilizá</w:t>
+      </w:r>
+      <w:proofErr w:type="spellEnd"/>
+      <w:r>
+        <w:rPr>
+          <w:lang w:val="es-AR"/>
+        </w:rPr>
+        <w:t xml:space="preserve"> una paleta basada en rojo/bordó, blanco y gris claro. </w:t>
+      </w:r>
+      <w:proofErr w:type="spellStart"/>
+      <w:r>
+        <w:rPr>
+          <w:lang w:val="es-AR"/>
+        </w:rPr>
+        <w:t>Colocá</w:t>
+      </w:r>
+      <w:proofErr w:type="spellEnd"/>
+      <w:r>
+        <w:rPr>
+          <w:lang w:val="es-AR"/>
+        </w:rPr>
+        <w:t xml:space="preserve"> un encabezado superior oscuro con el nombre del </w:t>
+      </w:r>
+      <w:proofErr w:type="spellStart"/>
+      <w:r>
+        <w:rPr>
+          <w:lang w:val="es-AR"/>
+        </w:rPr>
+        <w:t>dashboard</w:t>
+      </w:r>
+      <w:proofErr w:type="spellEnd"/>
+      <w:r>
+        <w:rPr>
+          <w:lang w:val="es-AR"/>
+        </w:rPr>
+        <w:t xml:space="preserve">, KPI destacados debajo, </w:t>
+      </w:r>
+      <w:proofErr w:type="spellStart"/>
+      <w:r>
+        <w:rPr>
+          <w:lang w:val="es-AR"/>
+        </w:rPr>
+        <w:t>segmentadores</w:t>
+      </w:r>
+      <w:proofErr w:type="spellEnd"/>
+      <w:r>
+        <w:rPr>
+          <w:lang w:val="es-AR"/>
+        </w:rPr>
+        <w:t xml:space="preserve"> en una sección independiente y gráficos distribuidos en una grilla. </w:t>
+      </w:r>
+      <w:proofErr w:type="spellStart"/>
+      <w:r>
+        <w:rPr>
+          <w:lang w:val="es-AR"/>
+        </w:rPr>
+        <w:t>Utilizá</w:t>
+      </w:r>
+      <w:proofErr w:type="spellEnd"/>
+      <w:r>
+        <w:rPr>
+          <w:lang w:val="es-AR"/>
+        </w:rPr>
+        <w:t xml:space="preserve"> títulos cortos, tipografía clara y bordes sutiles. El </w:t>
+      </w:r>
+      <w:proofErr w:type="spellStart"/>
+      <w:r>
+        <w:rPr>
+          <w:lang w:val="es-AR"/>
+        </w:rPr>
+        <w:t>dashboard</w:t>
+      </w:r>
+      <w:proofErr w:type="spellEnd"/>
+      <w:r>
+        <w:rPr>
+          <w:lang w:val="es-AR"/>
+        </w:rPr>
+        <w:t xml:space="preserve"> debe parecer una herramienta de análisis comercial profesional.</w:t>
+      </w:r>
+    </w:p>
+    <w:p>
+      <w:pPr>
+        <w:spacing w:after="80"/>
+        <w:rPr>
+          <w:lang w:val="es-AR"/>
+        </w:rPr>
+      </w:pPr>
+      <w:r>
+        <w:rPr>
+          <w:sz w:val="14"/>
+          <w:lang w:val="es-AR"/>
+        </w:rPr>
+        <w:t>──────────────────────────────────────────────────────────────────────────────────────────</w:t>
+      </w:r>
+    </w:p>
+    <w:p>
+      <w:pPr>
+        <w:spacing w:after="60"/>
+        <w:rPr>
+          <w:lang w:val="es-AR"/>
+        </w:rPr>
+      </w:pPr>
+      <w:r>
+        <w:rPr>
+          <w:b/>
+          <w:lang w:val="es-AR"/>
+        </w:rPr>
+        <w:t xml:space="preserve">Respuesta — </w:t>
+      </w:r>
+      <w:proofErr w:type="spellStart"/>
+      <w:r>
+        <w:rPr>
+          <w:b/>
+          <w:lang w:val="es-AR"/>
+        </w:rPr>
+        <w:t>ChatGPT</w:t>
+      </w:r>
+      <w:proofErr w:type="spellEnd"/>
+    </w:p>
+    <w:p>
+      <w:pPr>
+        <w:spacing w:after="160"/>
+        <w:ind w:left="360"/>
+        <w:rPr>
+          <w:lang w:val="es-AR"/>
+        </w:rPr>
+      </w:pPr>
+      <w:r>
+        <w:rPr>
+          <w:lang w:val="es-AR"/>
+        </w:rPr>
+        <w:t>Aplicaría la siguiente identidad visual:</w:t>
+      </w:r>
+      <w:r>
+        <w:rPr>
+          <w:lang w:val="es-AR"/>
+        </w:rPr>
+        <w:br/>
+      </w:r>
+      <w:r>
+        <w:rPr>
+          <w:lang w:val="es-AR"/>
+        </w:rPr>
+        <w:br/>
+        <w:t>• Bordó/rojo oscuro: encabezados y títulos de secciones.</w:t>
+      </w:r>
+      <w:r>
+        <w:rPr>
+          <w:lang w:val="es-AR"/>
+        </w:rPr>
+        <w:br/>
+        <w:t>• Blanco: fondo principal y tarjetas.</w:t>
+      </w:r>
+      <w:r>
+        <w:rPr>
+          <w:lang w:val="es-AR"/>
+        </w:rPr>
+        <w:br/>
+        <w:t>• Gris claro: separación entre bloques.</w:t>
+      </w:r>
+      <w:r>
+        <w:rPr>
+          <w:lang w:val="es-AR"/>
+        </w:rPr>
+        <w:br/>
+        <w:t>• Rojo más claro: elementos destacados y gráficos.</w:t>
+      </w:r>
+      <w:r>
+        <w:rPr>
+          <w:lang w:val="es-AR"/>
+        </w:rPr>
+        <w:br/>
+        <w:t>• Negro: números principales y texto.</w:t>
+      </w:r>
+      <w:r>
+        <w:rPr>
+          <w:lang w:val="es-AR"/>
+        </w:rPr>
+        <w:br/>
+      </w:r>
+      <w:r>
+        <w:rPr>
+          <w:lang w:val="es-AR"/>
+        </w:rPr>
+        <w:br/>
+        <w:t xml:space="preserve">La estructura sería: Encabezado → 4 KPI → </w:t>
+      </w:r>
+      <w:proofErr w:type="spellStart"/>
+      <w:r>
+        <w:rPr>
+          <w:lang w:val="es-AR"/>
+        </w:rPr>
+        <w:t>Segmentadores</w:t>
+      </w:r>
+      <w:proofErr w:type="spellEnd"/>
+      <w:r>
+        <w:rPr>
+          <w:lang w:val="es-AR"/>
+        </w:rPr>
+        <w:t xml:space="preserve"> → Gráfico de ventas + </w:t>
+      </w:r>
+      <w:proofErr w:type="spellStart"/>
+      <w:r>
+        <w:rPr>
+          <w:lang w:val="es-AR"/>
+        </w:rPr>
+        <w:t>Scatterplot</w:t>
+      </w:r>
+      <w:proofErr w:type="spellEnd"/>
+      <w:r>
+        <w:rPr>
+          <w:lang w:val="es-AR"/>
+        </w:rPr>
+        <w:t xml:space="preserve"> → Mix de productos + Productos + Compradores.</w:t>
+      </w:r>
+    </w:p>
+    <w:p>
+      <w:pPr>
+        <w:spacing w:after="80"/>
+        <w:rPr>
+          <w:lang w:val="es-AR"/>
+        </w:rPr>
+      </w:pPr>
+      <w:r>
+        <w:rPr>
+          <w:sz w:val="14"/>
+          <w:lang w:val="es-AR"/>
+        </w:rPr>
+        <w:t>──────────────────────────────────────────────────────────────────────────────────────────</w:t>
+      </w:r>
+    </w:p>
+    <w:p>
+      <w:pPr>
+        <w:spacing w:after="60"/>
+        <w:rPr>
+          <w:lang w:val="es-AR"/>
+        </w:rPr>
+      </w:pPr>
+      <w:proofErr w:type="spellStart"/>
+      <w:r>
+        <w:rPr>
+          <w:b/>
+          <w:lang w:val="es-AR"/>
+        </w:rPr>
+        <w:lastRenderedPageBreak/>
+        <w:t>Prompt</w:t>
+      </w:r>
+      <w:proofErr w:type="spellEnd"/>
+      <w:r>
+        <w:rPr>
+          <w:b/>
+          <w:lang w:val="es-AR"/>
+        </w:rPr>
+        <w:t xml:space="preserve"> 8 — Usuario</w:t>
+      </w:r>
+    </w:p>
+    <w:p>
+      <w:pPr>
+        <w:spacing w:after="160"/>
+        <w:ind w:left="360"/>
+        <w:rPr>
+          <w:lang w:val="es-AR"/>
+        </w:rPr>
+      </w:pPr>
+      <w:r>
+        <w:rPr>
+          <w:lang w:val="es-AR"/>
+        </w:rPr>
+        <w:t xml:space="preserve">Construí un </w:t>
+      </w:r>
+      <w:proofErr w:type="spellStart"/>
+      <w:r>
+        <w:rPr>
+          <w:lang w:val="es-AR"/>
+        </w:rPr>
+        <w:t>dashboard</w:t>
+      </w:r>
+      <w:proofErr w:type="spellEnd"/>
+      <w:r>
+        <w:rPr>
+          <w:lang w:val="es-AR"/>
+        </w:rPr>
+        <w:t xml:space="preserve"> ejecutivo de ventas para una empresa de repuestos automotrices utilizando la base proporcionada.</w:t>
+      </w:r>
+      <w:r>
+        <w:rPr>
+          <w:lang w:val="es-AR"/>
+        </w:rPr>
+        <w:br/>
+      </w:r>
+      <w:r>
+        <w:rPr>
+          <w:lang w:val="es-AR"/>
+        </w:rPr>
+        <w:br/>
+        <w:t>Debe incluir:</w:t>
+      </w:r>
+      <w:r>
+        <w:rPr>
+          <w:lang w:val="es-AR"/>
+        </w:rPr>
+        <w:br/>
+        <w:t xml:space="preserve">- un encabezado con el nombre del </w:t>
+      </w:r>
+      <w:proofErr w:type="spellStart"/>
+      <w:r>
+        <w:rPr>
+          <w:lang w:val="es-AR"/>
+        </w:rPr>
+        <w:t>dashboard</w:t>
+      </w:r>
+      <w:proofErr w:type="spellEnd"/>
+      <w:r>
+        <w:rPr>
+          <w:lang w:val="es-AR"/>
+        </w:rPr>
+        <w:t>;</w:t>
+      </w:r>
+      <w:r>
+        <w:rPr>
+          <w:lang w:val="es-AR"/>
+        </w:rPr>
+        <w:br/>
+        <w:t>- 4 KPI principales: venta neta, cumplimiento de meta, ticket promedio y unidades vendidas;</w:t>
+      </w:r>
+      <w:r>
+        <w:rPr>
+          <w:lang w:val="es-AR"/>
+        </w:rPr>
+        <w:br/>
+        <w:t xml:space="preserve">- </w:t>
+      </w:r>
+      <w:proofErr w:type="spellStart"/>
+      <w:r>
+        <w:rPr>
+          <w:lang w:val="es-AR"/>
+        </w:rPr>
+        <w:t>segmentadores</w:t>
+      </w:r>
+      <w:proofErr w:type="spellEnd"/>
+      <w:r>
+        <w:rPr>
+          <w:lang w:val="es-AR"/>
+        </w:rPr>
+        <w:t xml:space="preserve"> de período, categoría y región;</w:t>
+      </w:r>
+      <w:r>
+        <w:rPr>
+          <w:lang w:val="es-AR"/>
+        </w:rPr>
+        <w:br/>
+        <w:t>- gráfico de línea de venta neta mensual;</w:t>
+      </w:r>
+      <w:r>
+        <w:rPr>
+          <w:lang w:val="es-AR"/>
+        </w:rPr>
+        <w:br/>
+        <w:t xml:space="preserve">- </w:t>
+      </w:r>
+      <w:proofErr w:type="spellStart"/>
+      <w:r>
+        <w:rPr>
+          <w:lang w:val="es-AR"/>
+        </w:rPr>
+        <w:t>scatterplot</w:t>
+      </w:r>
+      <w:proofErr w:type="spellEnd"/>
+      <w:r>
+        <w:rPr>
+          <w:lang w:val="es-AR"/>
+        </w:rPr>
+        <w:t xml:space="preserve"> de unidades vendidas vs. venta neta;</w:t>
+      </w:r>
+      <w:r>
+        <w:rPr>
+          <w:lang w:val="es-AR"/>
+        </w:rPr>
+        <w:br/>
+        <w:t>- gráfico de participación por producto/categoría;</w:t>
+      </w:r>
+      <w:r>
+        <w:rPr>
+          <w:lang w:val="es-AR"/>
+        </w:rPr>
+        <w:br/>
+        <w:t>- tabla de productos con unidades vendidas;</w:t>
+      </w:r>
+      <w:r>
+        <w:rPr>
+          <w:lang w:val="es-AR"/>
+        </w:rPr>
+        <w:br/>
+        <w:t>- tabla de principales compradores;</w:t>
+      </w:r>
+      <w:r>
+        <w:rPr>
+          <w:lang w:val="es-AR"/>
+        </w:rPr>
+        <w:br/>
+        <w:t>- conclusiones ejecutivas basadas en los datos.</w:t>
+      </w:r>
+      <w:r>
+        <w:rPr>
+          <w:lang w:val="es-AR"/>
+        </w:rPr>
+        <w:br/>
+      </w:r>
+      <w:r>
+        <w:rPr>
+          <w:lang w:val="es-AR"/>
+        </w:rPr>
+        <w:br/>
+      </w:r>
+      <w:proofErr w:type="spellStart"/>
+      <w:r>
+        <w:rPr>
+          <w:lang w:val="es-AR"/>
+        </w:rPr>
+        <w:t>Utilizá</w:t>
+      </w:r>
+      <w:proofErr w:type="spellEnd"/>
+      <w:r>
+        <w:rPr>
+          <w:lang w:val="es-AR"/>
+        </w:rPr>
+        <w:t xml:space="preserve"> una estética profesional de empresa automotriz, con predominio de bordó/rojo, blanco y gris. </w:t>
+      </w:r>
+      <w:proofErr w:type="spellStart"/>
+      <w:r>
+        <w:rPr>
+          <w:lang w:val="es-AR"/>
+        </w:rPr>
+        <w:t>Priorizá</w:t>
+      </w:r>
+      <w:proofErr w:type="spellEnd"/>
+      <w:r>
+        <w:rPr>
+          <w:lang w:val="es-AR"/>
+        </w:rPr>
+        <w:t xml:space="preserve"> la legibilidad y </w:t>
+      </w:r>
+      <w:proofErr w:type="spellStart"/>
+      <w:r>
+        <w:rPr>
+          <w:lang w:val="es-AR"/>
+        </w:rPr>
+        <w:t>organizá</w:t>
+      </w:r>
+      <w:proofErr w:type="spellEnd"/>
+      <w:r>
+        <w:rPr>
+          <w:lang w:val="es-AR"/>
+        </w:rPr>
+        <w:t xml:space="preserve"> la información de mayor a menor nivel ejecutivo.</w:t>
+      </w:r>
+    </w:p>
+    <w:p>
+      <w:pPr>
+        <w:spacing w:after="80"/>
+        <w:rPr>
+          <w:lang w:val="es-AR"/>
+        </w:rPr>
+      </w:pPr>
+      <w:r>
+        <w:rPr>
+          <w:sz w:val="14"/>
+          <w:lang w:val="es-AR"/>
+        </w:rPr>
+        <w:t>──────────────────────────────────────────────────────────────────────────────────────────</w:t>
+      </w:r>
+    </w:p>
+    <w:p>
+      <w:pPr>
+        <w:spacing w:after="60"/>
+        <w:rPr>
+          <w:lang w:val="es-AR"/>
+        </w:rPr>
+      </w:pPr>
+      <w:r>
+        <w:rPr>
+          <w:b/>
+          <w:lang w:val="es-AR"/>
+        </w:rPr>
+        <w:t xml:space="preserve">Respuesta — </w:t>
+      </w:r>
+      <w:proofErr w:type="spellStart"/>
+      <w:r>
+        <w:rPr>
+          <w:b/>
+          <w:lang w:val="es-AR"/>
+        </w:rPr>
+        <w:t>ChatGPT</w:t>
+      </w:r>
+      <w:proofErr w:type="spellEnd"/>
+    </w:p>
+    <w:p>
+      <w:pPr>
+        <w:spacing w:after="160"/>
+        <w:ind w:left="360"/>
+        <w:rPr>
+          <w:lang w:val="es-AR"/>
+        </w:rPr>
+      </w:pPr>
+      <w:r>
+        <w:rPr>
+          <w:lang w:val="es-AR"/>
+        </w:rPr>
         <w:t>La propuesta final queda organizada de la siguiente manera:</w:t>
       </w:r>
       <w:r>
+        <w:rPr>
+          <w:lang w:val="es-AR"/>
+        </w:rPr>
         <w:br/>
       </w:r>
       <w:r>
+        <w:rPr>
+          <w:lang w:val="es-AR"/>
+        </w:rPr>
         <w:br/>
         <w:t>ENCABEZADO</w:t>
       </w:r>
       <w:r>
+        <w:rPr>
+          <w:lang w:val="es-AR"/>
+        </w:rPr>
         <w:br/>
         <w:t>↓</w:t>
       </w:r>
       <w:r>
+        <w:rPr>
+          <w:lang w:val="es-AR"/>
+        </w:rPr>
         <w:br/>
         <w:t>4 KPI: Venta neta | Cumplimiento | Ticket promedio | Unidades</w:t>
       </w:r>
       <w:r>
+        <w:rPr>
+          <w:lang w:val="es-AR"/>
+        </w:rPr>
         <w:br/>
         <w:t>↓</w:t>
       </w:r>
       <w:r>
+        <w:rPr>
+          <w:lang w:val="es-AR"/>
+        </w:rPr>
         <w:br/>
         <w:t>SEGMENTADORES: Período | Categoría | Región</w:t>
       </w:r>
       <w:r>
+        <w:rPr>
+          <w:lang w:val="es-AR"/>
+        </w:rPr>
         <w:br/>
         <w:t>↓</w:t>
       </w:r>
       <w:r>
+        <w:rPr>
+          <w:lang w:val="es-AR"/>
+        </w:rPr>
         <w:br/>
         <w:t>GRÁFICO DE VENTA NETA MENSUAL | UNIDADES VS. VENTA</w:t>
       </w:r>
       <w:r>
+        <w:rPr>
+          <w:lang w:val="es-AR"/>
+        </w:rPr>
         <w:br/>
         <w:t>↓</w:t>
       </w:r>
       <w:r>
+        <w:rPr>
+          <w:lang w:val="es-AR"/>
+        </w:rPr>
         <w:br/>
-        <w:t>PAR</w:t>
-      </w:r>
-      <w:r>
-        <w:t>TICIPACIÓN POR PRODUCTO | PRODUCTOS | COMPRADORES</w:t>
-      </w:r>
-      <w:r>
+        <w:t>PARTICIPACIÓN POR PRODUCTO | PRODUCTOS | COMPRADORES</w:t>
+      </w:r>
+      <w:r>
+        <w:rPr>
+          <w:lang w:val="es-AR"/>
+        </w:rPr>
         <w:br/>
       </w:r>
       <w:r>
+        <w:rPr>
+          <w:lang w:val="es-AR"/>
+        </w:rPr>
         <w:br/>
-        <w:t xml:space="preserve">El dashboard permite pasar de una visión general a una explicación más detallada: ¿Cuánto vendimos? → ¿Cuándo vendimos? → ¿Qué relación existe entre volumen y ventas? → ¿Qué productos y </w:t>
+        <w:t xml:space="preserve">El </w:t>
       </w:r>
       <w:proofErr w:type="spellStart"/>
       <w:r>
-        <w:t>clientes</w:t>
+        <w:rPr>
+          <w:lang w:val="es-AR"/>
+        </w:rPr>
+        <w:t>dashboard</w:t>
       </w:r>
       <w:proofErr w:type="spellEnd"/>
       <w:r>
-        <w:t xml:space="preserve"> </w:t>
-      </w:r>
-      <w:proofErr w:type="spellStart"/>
-      <w:r>
-        <w:t>explican</w:t>
-      </w:r>
-      <w:proofErr w:type="spellEnd"/>
-      <w:r>
-        <w:t xml:space="preserve"> e</w:t>
-      </w:r>
-      <w:r>
-        <w:t xml:space="preserve">l </w:t>
-      </w:r>
-      <w:proofErr w:type="spellStart"/>
-      <w:r>
-        <w:t>resultado</w:t>
-      </w:r>
-      <w:proofErr w:type="spellEnd"/>
-      <w:r>
-        <w:t>?</w:t>
+        <w:rPr>
+          <w:lang w:val="es-AR"/>
+        </w:rPr>
+        <w:t xml:space="preserve"> permite pasar de una visión general a una explicación más detallada: ¿Cuánto vendimos? → ¿Cuándo vendimos? → ¿Qué relación existe entre volumen y ventas? → ¿Qué productos y clientes explican el resultado?</w:t>
       </w:r>
     </w:p>
     <w:sectPr>
@@ -1250,7 +2314,7 @@
 </file>
 
 <file path=word/numbering.xml><?xml version="1.0" encoding="utf-8"?>
-<w:numbering xmlns:wpc="http://schemas.microsoft.com/office/word/2010/wordprocessingCanvas" xmlns:mc="http://schemas.openxmlformats.org/markup-compatibility/2006" xmlns:o="urn:schemas-microsoft-com:office:office" xmlns:r="http://schemas.openxmlformats.org/officeDocument/2006/relationships" xmlns:m="http://schemas.openxmlformats.org/officeDocument/2006/math" xmlns:v="urn:schemas-microsoft-com:vml" xmlns:wp14="http://schemas.microsoft.com/office/word/2010/wordprocessingDrawing" xmlns:wp="http://schemas.openxmlformats.org/drawingml/2006/wordprocessingDrawing" xmlns:w10="urn:schemas-microsoft-com:office:word" xmlns:w="http://schemas.openxmlformats.org/wordprocessingml/2006/main" xmlns:w14="http://schemas.microsoft.com/office/word/2010/wordml" xmlns:w15="http://schemas.microsoft.com/office/word/2012/wordml" xmlns:wpg="http://schemas.microsoft.com/office/word/2010/wordprocessingGroup" xmlns:wpi="http://schemas.microsoft.com/office/word/2010/wordprocessingInk" xmlns:wne="http://schemas.microsoft.com/office/word/2006/wordml" xmlns:wps="http://schemas.microsoft.com/office/word/2010/wordprocessingShape" mc:Ignorable="w14 w15 wp14">
+<w:numbering xmlns:wpc="http://schemas.microsoft.com/office/word/2010/wordprocessingCanvas" xmlns:cx="http://schemas.microsoft.com/office/drawing/2014/chartex" xmlns:cx1="http://schemas.microsoft.com/office/drawing/2015/9/8/chartex" xmlns:cx2="http://schemas.microsoft.com/office/drawing/2015/10/21/chartex" xmlns:cx3="http://schemas.microsoft.com/office/drawing/2016/5/9/chartex" xmlns:cx4="http://schemas.microsoft.com/office/drawing/2016/5/10/chartex" xmlns:cx5="http://schemas.microsoft.com/office/drawing/2016/5/11/chartex" xmlns:cx6="http://schemas.microsoft.com/office/drawing/2016/5/12/chartex" xmlns:cx7="http://schemas.microsoft.com/office/drawing/2016/5/13/chartex" xmlns:cx8="http://schemas.microsoft.com/office/drawing/2016/5/14/chartex" xmlns:mc="http://schemas.openxmlformats.org/markup-compatibility/2006" xmlns:m="http://schemas.openxmlformats.org/officeDocument/2006/math" xmlns:aink="http://schemas.microsoft.com/office/drawing/2016/ink" xmlns:am3d="http://schemas.microsoft.com/office/drawing/2017/model3d" xmlns:oel="http://schemas.microsoft.com/office/2019/extlst" xmlns:r="http://schemas.openxmlformats.org/officeDocument/2006/relationships" xmlns:wp14="http://schemas.microsoft.com/office/word/2010/wordprocessingDrawing" xmlns:wp="http://schemas.openxmlformats.org/drawingml/2006/wordprocessingDrawing" xmlns:wpg="http://schemas.microsoft.com/office/word/2010/wordprocessingGroup" xmlns:wpi="http://schemas.microsoft.com/office/word/2010/wordprocessingInk" xmlns:wps="http://schemas.microsoft.com/office/word/2010/wordprocessingShape" xmlns:o="urn:schemas-microsoft-com:office:office" xmlns:v="urn:schemas-microsoft-com:vml" xmlns:w10="urn:schemas-microsoft-com:office:word" xmlns:w="http://schemas.openxmlformats.org/wordprocessingml/2006/main" xmlns:w14="http://schemas.microsoft.com/office/word/2010/wordml" xmlns:w15="http://schemas.microsoft.com/office/word/2012/wordml" xmlns:w16cex="http://schemas.microsoft.com/office/word/2018/wordml/cex" xmlns:w16cid="http://schemas.microsoft.com/office/word/2016/wordml/cid" xmlns:w16="http://schemas.microsoft.com/office/word/2018/wordml" xmlns:w16sdtdh="http://schemas.microsoft.com/office/word/2020/wordml/sdtdatahash" xmlns:w16sdtfl="http://schemas.microsoft.com/office/word/2024/wordml/sdtformatlock" xmlns:w16se="http://schemas.microsoft.com/office/word/2015/wordml/symex" xmlns:w16du="http://schemas.microsoft.com/office/word/2023/wordml/word16du" xmlns:wne="http://schemas.microsoft.com/office/word/2006/wordml" mc:Ignorable="w14 w15 w16se w16cid w16 w16cex w16sdtdh w16sdtfl w16du wp14">
   <w:abstractNum w:abstractNumId="0" w15:restartNumberingAfterBreak="0">
     <w:nsid w:val="FFFFFF7C"/>
     <w:multiLevelType w:val="singleLevel"/>
@@ -1422,38 +2486,38 @@
       </w:rPr>
     </w:lvl>
   </w:abstractNum>
-  <w:num w:numId="1">
+  <w:num w:numId="1" w16cid:durableId="1836602270">
     <w:abstractNumId w:val="8"/>
   </w:num>
-  <w:num w:numId="2">
+  <w:num w:numId="2" w16cid:durableId="1790737009">
     <w:abstractNumId w:val="6"/>
   </w:num>
-  <w:num w:numId="3">
+  <w:num w:numId="3" w16cid:durableId="907616943">
     <w:abstractNumId w:val="5"/>
   </w:num>
-  <w:num w:numId="4">
+  <w:num w:numId="4" w16cid:durableId="173307500">
     <w:abstractNumId w:val="4"/>
   </w:num>
-  <w:num w:numId="5">
+  <w:num w:numId="5" w16cid:durableId="1860705514">
     <w:abstractNumId w:val="7"/>
   </w:num>
-  <w:num w:numId="6">
+  <w:num w:numId="6" w16cid:durableId="1326012996">
     <w:abstractNumId w:val="3"/>
   </w:num>
-  <w:num w:numId="7">
+  <w:num w:numId="7" w16cid:durableId="548762203">
     <w:abstractNumId w:val="2"/>
   </w:num>
-  <w:num w:numId="8">
+  <w:num w:numId="8" w16cid:durableId="2120027952">
     <w:abstractNumId w:val="1"/>
   </w:num>
-  <w:num w:numId="9">
+  <w:num w:numId="9" w16cid:durableId="2012483784">
     <w:abstractNumId w:val="0"/>
   </w:num>
 </w:numbering>
 </file>
 
 <file path=word/styles.xml><?xml version="1.0" encoding="utf-8"?>
-<w:styles xmlns:mc="http://schemas.openxmlformats.org/markup-compatibility/2006" xmlns:r="http://schemas.openxmlformats.org/officeDocument/2006/relationships" xmlns:w="http://schemas.openxmlformats.org/wordprocessingml/2006/main" xmlns:w14="http://schemas.microsoft.com/office/word/2010/wordml" xmlns:w15="http://schemas.microsoft.com/office/word/2012/wordml" mc:Ignorable="w14 w15">
+<w:styles xmlns:mc="http://schemas.openxmlformats.org/markup-compatibility/2006" xmlns:r="http://schemas.openxmlformats.org/officeDocument/2006/relationships" xmlns:w="http://schemas.openxmlformats.org/wordprocessingml/2006/main" xmlns:w14="http://schemas.microsoft.com/office/word/2010/wordml" xmlns:w15="http://schemas.microsoft.com/office/word/2012/wordml" xmlns:w16cex="http://schemas.microsoft.com/office/word/2018/wordml/cex" xmlns:w16cid="http://schemas.microsoft.com/office/word/2016/wordml/cid" xmlns:w16="http://schemas.microsoft.com/office/word/2018/wordml" xmlns:w16sdtdh="http://schemas.microsoft.com/office/word/2020/wordml/sdtdatahash" xmlns:w16sdtfl="http://schemas.microsoft.com/office/word/2024/wordml/sdtformatlock" xmlns:w16se="http://schemas.microsoft.com/office/word/2015/wordml/symex" xmlns:w16du="http://schemas.microsoft.com/office/word/2023/wordml/word16du" mc:Ignorable="w14 w15 w16se w16cid w16 w16cex w16sdtdh w16sdtfl w16du">
   <w:docDefaults>
     <w:rPrDefault>
       <w:rPr>
@@ -1469,7 +2533,7 @@
       </w:pPr>
     </w:pPrDefault>
   </w:docDefaults>
-  <w:latentStyles w:defLockedState="0" w:defUIPriority="99" w:defSemiHidden="0" w:defUnhideWhenUsed="0" w:defQFormat="0" w:count="371">
+  <w:latentStyles w:defLockedState="0" w:defUIPriority="99" w:defSemiHidden="0" w:defUnhideWhenUsed="0" w:defQFormat="0" w:count="376">
     <w:lsdException w:name="Normal" w:uiPriority="0" w:qFormat="1"/>
     <w:lsdException w:name="heading 1" w:uiPriority="9" w:qFormat="1"/>
     <w:lsdException w:name="heading 2" w:semiHidden="1" w:uiPriority="9" w:unhideWhenUsed="1" w:qFormat="1"/>
@@ -1832,6 +2896,11 @@
     <w:lsdException w:name="List Table 5 Dark Accent 6" w:uiPriority="50"/>
     <w:lsdException w:name="List Table 6 Colorful Accent 6" w:uiPriority="51"/>
     <w:lsdException w:name="List Table 7 Colorful Accent 6" w:uiPriority="52"/>
+    <w:lsdException w:name="Mention" w:semiHidden="1" w:unhideWhenUsed="1"/>
+    <w:lsdException w:name="Smart Hyperlink" w:semiHidden="1" w:unhideWhenUsed="1"/>
+    <w:lsdException w:name="Hashtag" w:semiHidden="1" w:unhideWhenUsed="1"/>
+    <w:lsdException w:name="Unresolved Mention" w:semiHidden="1" w:unhideWhenUsed="1"/>
+    <w:lsdException w:name="Smart Link" w:semiHidden="1" w:unhideWhenUsed="1"/>
   </w:latentStyles>
   <w:style w:type="paragraph" w:default="1" w:styleId="Normal">
     <w:name w:val="Normal"/>
@@ -2174,11 +3243,11 @@
       <w:color w:val="4F81BD" w:themeColor="accent1"/>
     </w:rPr>
   </w:style>
-  <w:style w:type="paragraph" w:styleId="Puesto">
+  <w:style w:type="paragraph" w:styleId="Ttulo">
     <w:name w:val="Title"/>
     <w:basedOn w:val="Normal"/>
     <w:next w:val="Normal"/>
-    <w:link w:val="PuestoCar"/>
+    <w:link w:val="TtuloCar"/>
     <w:uiPriority w:val="10"/>
     <w:qFormat/>
     <w:rsid w:val="00FC693F"/>
@@ -2198,10 +3267,10 @@
       <w:szCs w:val="52"/>
     </w:rPr>
   </w:style>
-  <w:style w:type="character" w:customStyle="1" w:styleId="PuestoCar">
-    <w:name w:val="Puesto Car"/>
+  <w:style w:type="character" w:customStyle="1" w:styleId="TtuloCar">
+    <w:name w:val="Título Car"/>
     <w:basedOn w:val="Fuentedeprrafopredeter"/>
-    <w:link w:val="Puesto"/>
+    <w:link w:val="Ttulo"/>
     <w:uiPriority w:val="10"/>
     <w:rsid w:val="00FC693F"/>
     <w:rPr>
@@ -2639,7 +3708,7 @@
       <w:szCs w:val="18"/>
     </w:rPr>
   </w:style>
-  <w:style w:type="character" w:styleId="Textoennegrita">
+  <w:style w:type="character" w:styleId="Fuerte">
     <w:name w:val="Strong"/>
     <w:basedOn w:val="Fuentedeprrafopredeter"/>
     <w:uiPriority w:val="22"/>
@@ -2764,7 +3833,7 @@
       <w:spacing w:val="5"/>
     </w:rPr>
   </w:style>
-  <w:style w:type="paragraph" w:styleId="TtulodeTDC">
+  <w:style w:type="paragraph" w:styleId="TtuloTDC">
     <w:name w:val="TOC Heading"/>
     <w:basedOn w:val="Ttulo1"/>
     <w:next w:val="Normal"/>

</xml_diff>